<commit_message>
Added more examples of web scrapping (yahoo finance & investing.com). Added Co-pilot chat session - part 3
</commit_message>
<xml_diff>
--- a/AI Chat Sessions/Co-pilot chat web scrapping - python - using custom api Part 2 - 11-03-2024.docx
+++ b/AI Chat Sessions/Co-pilot chat web scrapping - python - using custom api Part 2 - 11-03-2024.docx
@@ -221,7 +221,7 @@
         <w:pStyle w:val="paragraph-text"/>
         <w:numPr>
           <w:ilvl w:val="0"/>
-          <w:numId w:val="3"/>
+          <w:numId w:val="5"/>
         </w:numPr>
       </w:pPr>
       <w:r>
@@ -248,7 +248,7 @@
         <w:pStyle w:val="paragraph-text"/>
         <w:numPr>
           <w:ilvl w:val="0"/>
-          <w:numId w:val="3"/>
+          <w:numId w:val="5"/>
         </w:numPr>
       </w:pPr>
       <w:r>
@@ -275,7 +275,7 @@
         <w:pStyle w:val="paragraph-text"/>
         <w:numPr>
           <w:ilvl w:val="0"/>
-          <w:numId w:val="3"/>
+          <w:numId w:val="5"/>
         </w:numPr>
       </w:pPr>
       <w:r>
@@ -2318,7 +2318,7 @@
         <w:pStyle w:val="paragraph-text"/>
         <w:numPr>
           <w:ilvl w:val="0"/>
-          <w:numId w:val="3"/>
+          <w:numId w:val="5"/>
         </w:numPr>
       </w:pPr>
       <w:r>
@@ -2373,7 +2373,7 @@
         <w:pStyle w:val="paragraph-text"/>
         <w:numPr>
           <w:ilvl w:val="0"/>
-          <w:numId w:val="3"/>
+          <w:numId w:val="5"/>
         </w:numPr>
       </w:pPr>
       <w:r>
@@ -2428,7 +2428,7 @@
         <w:pStyle w:val="paragraph-text"/>
         <w:numPr>
           <w:ilvl w:val="0"/>
-          <w:numId w:val="3"/>
+          <w:numId w:val="5"/>
         </w:numPr>
       </w:pPr>
       <w:r>
@@ -2603,7 +2603,7 @@
         <w:pStyle w:val="paragraph-text"/>
         <w:numPr>
           <w:ilvl w:val="0"/>
-          <w:numId w:val="3"/>
+          <w:numId w:val="5"/>
         </w:numPr>
       </w:pPr>
       <w:r>
@@ -2640,7 +2640,7 @@
         <w:pStyle w:val="paragraph-text"/>
         <w:numPr>
           <w:ilvl w:val="0"/>
-          <w:numId w:val="3"/>
+          <w:numId w:val="5"/>
         </w:numPr>
       </w:pPr>
       <w:r>
@@ -2691,7 +2691,7 @@
         <w:pStyle w:val="paragraph-text"/>
         <w:numPr>
           <w:ilvl w:val="0"/>
-          <w:numId w:val="3"/>
+          <w:numId w:val="5"/>
         </w:numPr>
       </w:pPr>
       <w:r>
@@ -6058,6 +6058,2984 @@
         <w:t xml:space="preserve">I hope this helps! Let me know if you have any other questions. 😊</w:t>
       </w:r>
     </w:p>
+    <w:p>
+      <w:pPr>
+        <w:pStyle w:val="Heading1"/>
+      </w:pPr>
+      <w:r>
+        <w:rPr>
+          <w:color w:val="005366"/>
+        </w:rPr>
+        <w:t xml:space="preserve">You</w:t>
+      </w:r>
+    </w:p>
+    <w:p>
+      <w:pPr>
+        <w:pStyle w:val="paragraph-text"/>
+      </w:pPr>
+      <w:r>
+        <w:t xml:space="preserve">In the code below, I have scrapped data using custom api. Please change the code to get data in a similar way from yahoo finance using yfinance python library:</w:t>
+      </w:r>
+    </w:p>
+    <w:p>
+      <w:pPr>
+        <w:pStyle w:val="paragraph-text"/>
+      </w:pPr>
+      <w:r>
+        <w:t xml:space="preserve">import requests
+import json
+import datetime
+import xlwings as xw
+@xw.func
+def get_url_data(country, symbol, from_date, to_date):
+url = f'http://api.scraperlink.com/investpy/?email=asharindani51@gmail.com&amp;type=historical_data&amp;product=stocks&amp;country={country}&amp;symbol={symbol}&amp;from_date={from_date}&amp;to_date={to_date}'
+response = requests.get(url)
+json_output = response.json()  # This is already a Python dictionary
+data_list = json_output['data']
+data = []
+if data_list:
+# Add headers as the first row in data
+headers = list(data_list[0].keys())
+data.append(headers)
+for item in data_list:
+if item is not None:
+data.append(list(item.values()))
+return data</w:t>
+      </w:r>
+    </w:p>
+    <w:p>
+      <w:pPr>
+        <w:pStyle w:val="Heading1"/>
+      </w:pPr>
+      <w:r>
+        <w:rPr>
+          <w:color w:val="123BB6"/>
+        </w:rPr>
+        <w:t xml:space="preserve">Copilot</w:t>
+      </w:r>
+    </w:p>
+    <w:p>
+      <w:pPr>
+        <w:pStyle w:val="paragraph-text"/>
+      </w:pPr>
+      <w:r>
+        <w:t xml:space="preserve">Sure, you can use the </w:t>
+      </w:r>
+      <w:r>
+        <w:rPr>
+          <w:color w:val="111111"/>
+          <w:shd w:fill="F1F1F1" w:color="auto" w:val="clear"/>
+        </w:rPr>
+        <w:t xml:space="preserve">yfinance</w:t>
+      </w:r>
+      <w:r>
+        <w:t xml:space="preserve"> library to download historical market data from Yahoo Finance. Here's how you can modify your function to do this:</w:t>
+      </w:r>
+    </w:p>
+    <w:p>
+      <w:pPr>
+        <w:pStyle w:val="code"/>
+      </w:pPr>
+      <w:r>
+        <w:t xml:space="preserve">import yfinance as yf</w:t>
+      </w:r>
+    </w:p>
+    <w:p>
+      <w:pPr>
+        <w:pStyle w:val="code"/>
+      </w:pPr>
+      <w:r>
+        <w:t xml:space="preserve">import xlwings as xw</w:t>
+      </w:r>
+    </w:p>
+    <w:p>
+      <w:pPr>
+        <w:pStyle w:val="code"/>
+      </w:pPr>
+      <w:r>
+        <w:t xml:space="preserve"/>
+      </w:r>
+    </w:p>
+    <w:p>
+      <w:pPr>
+        <w:pStyle w:val="code"/>
+      </w:pPr>
+      <w:r>
+        <w:t xml:space="preserve">@xw.func</w:t>
+      </w:r>
+    </w:p>
+    <w:p>
+      <w:pPr>
+        <w:pStyle w:val="code"/>
+      </w:pPr>
+      <w:r>
+        <w:t xml:space="preserve">def get_stock_data(symbol, start_date, end_date):</w:t>
+      </w:r>
+    </w:p>
+    <w:p>
+      <w:pPr>
+        <w:pStyle w:val="code"/>
+      </w:pPr>
+      <w:r>
+        <w:t xml:space="preserve">    # Download historical market data</w:t>
+      </w:r>
+    </w:p>
+    <w:p>
+      <w:pPr>
+        <w:pStyle w:val="code"/>
+      </w:pPr>
+      <w:r>
+        <w:t xml:space="preserve">    hist = yf.Ticker(symbol).history(start=start_date, end=end_date)</w:t>
+      </w:r>
+    </w:p>
+    <w:p>
+      <w:pPr>
+        <w:pStyle w:val="code"/>
+      </w:pPr>
+      <w:r>
+        <w:t xml:space="preserve">    # Prepare data for output</w:t>
+      </w:r>
+    </w:p>
+    <w:p>
+      <w:pPr>
+        <w:pStyle w:val="code"/>
+      </w:pPr>
+      <w:r>
+        <w:t xml:space="preserve">    data = [hist.columns.values.tolist()] + hist.reset_index().values.tolist()</w:t>
+      </w:r>
+    </w:p>
+    <w:p>
+      <w:pPr>
+        <w:pStyle w:val="code"/>
+      </w:pPr>
+      <w:r>
+        <w:t xml:space="preserve">    return data</w:t>
+      </w:r>
+    </w:p>
+    <w:p>
+      <w:pPr>
+        <w:pStyle w:val="paragraph-text"/>
+      </w:pPr>
+      <w:r>
+        <w:t xml:space="preserve">In this function, </w:t>
+      </w:r>
+      <w:r>
+        <w:rPr>
+          <w:color w:val="111111"/>
+          <w:shd w:fill="F1F1F1" w:color="auto" w:val="clear"/>
+        </w:rPr>
+        <w:t xml:space="preserve">yf.Ticker(symbol).history(start=start_date, end=end_date)</w:t>
+      </w:r>
+      <w:r>
+        <w:t xml:space="preserve"> downloads the historical market data for the specified symbol between the start date and end date. The </w:t>
+      </w:r>
+      <w:r>
+        <w:rPr>
+          <w:color w:val="111111"/>
+          <w:shd w:fill="F1F1F1" w:color="auto" w:val="clear"/>
+        </w:rPr>
+        <w:t xml:space="preserve">history</w:t>
+      </w:r>
+      <w:r>
+        <w:t xml:space="preserve"> method returns a pandas DataFrame.</w:t>
+      </w:r>
+    </w:p>
+    <w:p>
+      <w:pPr>
+        <w:pStyle w:val="paragraph-text"/>
+      </w:pPr>
+      <w:r>
+        <w:t xml:space="preserve">The line </w:t>
+      </w:r>
+      <w:r>
+        <w:rPr>
+          <w:color w:val="111111"/>
+          <w:shd w:fill="F1F1F1" w:color="auto" w:val="clear"/>
+        </w:rPr>
+        <w:t xml:space="preserve">data = [hist.columns.values.tolist()] + hist.reset_index().values.tolist()</w:t>
+      </w:r>
+      <w:r>
+        <w:t xml:space="preserve"> prepares the data for output. It creates a list of lists where the first list is the column headers and the remaining lists are the rows of data.</w:t>
+      </w:r>
+    </w:p>
+    <w:p>
+      <w:pPr>
+        <w:pStyle w:val="paragraph-text"/>
+      </w:pPr>
+      <w:r>
+        <w:t xml:space="preserve">You can call this function from Excel using the formula </w:t>
+      </w:r>
+      <w:r>
+        <w:rPr>
+          <w:color w:val="111111"/>
+          <w:shd w:fill="F1F1F1" w:color="auto" w:val="clear"/>
+        </w:rPr>
+        <w:t xml:space="preserve">=get_stock_data(symbol, start_date, end_date)</w:t>
+      </w:r>
+      <w:r>
+        <w:t xml:space="preserve">. Replace </w:t>
+      </w:r>
+      <w:r>
+        <w:rPr>
+          <w:color w:val="111111"/>
+          <w:shd w:fill="F1F1F1" w:color="auto" w:val="clear"/>
+        </w:rPr>
+        <w:t xml:space="preserve">symbol</w:t>
+      </w:r>
+      <w:r>
+        <w:t xml:space="preserve">, </w:t>
+      </w:r>
+      <w:r>
+        <w:rPr>
+          <w:color w:val="111111"/>
+          <w:shd w:fill="F1F1F1" w:color="auto" w:val="clear"/>
+        </w:rPr>
+        <w:t xml:space="preserve">start_date</w:t>
+      </w:r>
+      <w:r>
+        <w:t xml:space="preserve">, and </w:t>
+      </w:r>
+      <w:r>
+        <w:rPr>
+          <w:color w:val="111111"/>
+          <w:shd w:fill="F1F1F1" w:color="auto" w:val="clear"/>
+        </w:rPr>
+        <w:t xml:space="preserve">end_date</w:t>
+      </w:r>
+      <w:r>
+        <w:t xml:space="preserve"> with the actual values or cell references.</w:t>
+      </w:r>
+    </w:p>
+    <w:p>
+      <w:pPr>
+        <w:pStyle w:val="paragraph-text"/>
+      </w:pPr>
+      <w:r>
+        <w:t xml:space="preserve">Please note that the dates should be in the format 'yyyy-mm-dd'. Also, you need to install the </w:t>
+      </w:r>
+      <w:r>
+        <w:rPr>
+          <w:color w:val="111111"/>
+          <w:shd w:fill="F1F1F1" w:color="auto" w:val="clear"/>
+        </w:rPr>
+        <w:t xml:space="preserve">yfinance</w:t>
+      </w:r>
+      <w:r>
+        <w:t xml:space="preserve"> library if you haven't already. You can install it using pip:</w:t>
+      </w:r>
+    </w:p>
+    <w:p>
+      <w:pPr>
+        <w:pStyle w:val="code"/>
+      </w:pPr>
+      <w:r>
+        <w:t xml:space="preserve">pip install yfinance</w:t>
+      </w:r>
+    </w:p>
+    <w:p>
+      <w:pPr>
+        <w:pStyle w:val="paragraph-text"/>
+      </w:pPr>
+      <w:r>
+        <w:t xml:space="preserve">I hope this helps! Let me know if you have any other questions. 😊</w:t>
+      </w:r>
+    </w:p>
+    <w:p>
+      <w:pPr>
+        <w:pStyle w:val="Heading1"/>
+      </w:pPr>
+      <w:r>
+        <w:rPr>
+          <w:color w:val="005366"/>
+        </w:rPr>
+        <w:t xml:space="preserve">You</w:t>
+      </w:r>
+    </w:p>
+    <w:p>
+      <w:pPr>
+        <w:pStyle w:val="paragraph-text"/>
+      </w:pPr>
+      <w:r>
+        <w:t xml:space="preserve">Can you find out why using the above in xlwings like: =get_stock_data_y("ZYDUSLIFE","01/01/2018","12/31/2023")</w:t>
+      </w:r>
+    </w:p>
+    <w:p>
+      <w:pPr>
+        <w:pStyle w:val="paragraph-text"/>
+      </w:pPr>
+      <w:r>
+        <w:t xml:space="preserve">got me error in excel cellas #NAME?</w:t>
+      </w:r>
+    </w:p>
+    <w:p>
+      <w:pPr>
+        <w:pStyle w:val="Heading1"/>
+      </w:pPr>
+      <w:r>
+        <w:rPr>
+          <w:color w:val="123BB6"/>
+        </w:rPr>
+        <w:t xml:space="preserve">Copilot</w:t>
+      </w:r>
+    </w:p>
+    <w:p>
+      <w:pPr>
+        <w:pStyle w:val="paragraph-text"/>
+      </w:pPr>
+      <w:r>
+        <w:t xml:space="preserve">The </w:t>
+      </w:r>
+      <w:r>
+        <w:rPr>
+          <w:color w:val="111111"/>
+          <w:shd w:fill="F1F1F1" w:color="auto" w:val="clear"/>
+        </w:rPr>
+        <w:t xml:space="preserve">#NAME?</w:t>
+      </w:r>
+      <w:r>
+        <w:t xml:space="preserve"> error in Excel typically means that Excel doesn't recognize text in the formula. In the context of </w:t>
+      </w:r>
+      <w:r>
+        <w:rPr>
+          <w:color w:val="111111"/>
+          <w:shd w:fill="F1F1F1" w:color="auto" w:val="clear"/>
+        </w:rPr>
+        <w:t xml:space="preserve">xlwings</w:t>
+      </w:r>
+      <w:r>
+        <w:t xml:space="preserve">, this error usually occurs when the Python function you're trying to call from Excel is not available.</w:t>
+      </w:r>
+    </w:p>
+    <w:p>
+      <w:pPr>
+        <w:pStyle w:val="paragraph-text"/>
+      </w:pPr>
+      <w:r>
+        <w:t xml:space="preserve">Here are a few things you can check:</w:t>
+      </w:r>
+    </w:p>
+    <w:p>
+      <w:pPr>
+        <w:pStyle w:val="paragraph-text"/>
+        <w:numPr>
+          <w:ilvl w:val="0"/>
+          <w:numId w:val="5"/>
+        </w:numPr>
+      </w:pPr>
+      <w:r>
+        <w:rPr>
+          <w:b/>
+          <w:bCs/>
+        </w:rPr>
+        <w:t xml:space="preserve">Function Name</w:t>
+      </w:r>
+      <w:r>
+        <w:t xml:space="preserve">: Make sure that the function name in your Excel formula matches the name of the function in your Python script. In your case, the function should be named </w:t>
+      </w:r>
+      <w:r>
+        <w:rPr>
+          <w:color w:val="111111"/>
+          <w:shd w:fill="F1F1F1" w:color="auto" w:val="clear"/>
+        </w:rPr>
+        <w:t xml:space="preserve">get_stock_data_y</w:t>
+      </w:r>
+      <w:r>
+        <w:t xml:space="preserve">.</w:t>
+      </w:r>
+    </w:p>
+    <w:p>
+      <w:pPr>
+        <w:pStyle w:val="paragraph-text"/>
+        <w:numPr>
+          <w:ilvl w:val="0"/>
+          <w:numId w:val="5"/>
+        </w:numPr>
+      </w:pPr>
+      <w:r>
+        <w:rPr>
+          <w:b/>
+          <w:bCs/>
+        </w:rPr>
+        <w:t xml:space="preserve">Python Script Running</w:t>
+      </w:r>
+      <w:r>
+        <w:t xml:space="preserve">: Ensure that your Python script with the </w:t>
+      </w:r>
+      <w:r>
+        <w:rPr>
+          <w:color w:val="111111"/>
+          <w:shd w:fill="F1F1F1" w:color="auto" w:val="clear"/>
+        </w:rPr>
+        <w:t xml:space="preserve">xlwings</w:t>
+      </w:r>
+      <w:r>
+        <w:t xml:space="preserve"> function is running while you're trying to call the function from Excel.</w:t>
+      </w:r>
+    </w:p>
+    <w:p>
+      <w:pPr>
+        <w:pStyle w:val="paragraph-text"/>
+        <w:numPr>
+          <w:ilvl w:val="0"/>
+          <w:numId w:val="5"/>
+        </w:numPr>
+      </w:pPr>
+      <w:r>
+        <w:rPr>
+          <w:b/>
+          <w:bCs/>
+        </w:rPr>
+        <w:t xml:space="preserve">xlwings Add-in</w:t>
+      </w:r>
+      <w:r>
+        <w:t xml:space="preserve">: Make sure that the </w:t>
+      </w:r>
+      <w:r>
+        <w:rPr>
+          <w:color w:val="111111"/>
+          <w:shd w:fill="F1F1F1" w:color="auto" w:val="clear"/>
+        </w:rPr>
+        <w:t xml:space="preserve">xlwings</w:t>
+      </w:r>
+      <w:r>
+        <w:t xml:space="preserve"> add-in is installed and active in Excel.</w:t>
+      </w:r>
+    </w:p>
+    <w:p>
+      <w:pPr>
+        <w:pStyle w:val="paragraph-text"/>
+        <w:numPr>
+          <w:ilvl w:val="0"/>
+          <w:numId w:val="5"/>
+        </w:numPr>
+      </w:pPr>
+      <w:r>
+        <w:rPr>
+          <w:b/>
+          <w:bCs/>
+        </w:rPr>
+        <w:t xml:space="preserve">Workbook Name</w:t>
+      </w:r>
+      <w:r>
+        <w:t xml:space="preserve">: If you're using the </w:t>
+      </w:r>
+      <w:r>
+        <w:rPr>
+          <w:color w:val="111111"/>
+          <w:shd w:fill="F1F1F1" w:color="auto" w:val="clear"/>
+        </w:rPr>
+        <w:t xml:space="preserve">xlwings</w:t>
+      </w:r>
+      <w:r>
+        <w:t xml:space="preserve"> add-in, make sure that the name of your Excel workbook matches the name of your Python script (without the </w:t>
+      </w:r>
+      <w:r>
+        <w:rPr>
+          <w:color w:val="111111"/>
+          <w:shd w:fill="F1F1F1" w:color="auto" w:val="clear"/>
+        </w:rPr>
+        <w:t xml:space="preserve">.py</w:t>
+      </w:r>
+      <w:r>
+        <w:t xml:space="preserve"> extension), or that you've set the correct path to your Python script in the </w:t>
+      </w:r>
+      <w:r>
+        <w:rPr>
+          <w:color w:val="111111"/>
+          <w:shd w:fill="F1F1F1" w:color="auto" w:val="clear"/>
+        </w:rPr>
+        <w:t xml:space="preserve">xlwings</w:t>
+      </w:r>
+      <w:r>
+        <w:t xml:space="preserve"> add-in settings.</w:t>
+      </w:r>
+    </w:p>
+    <w:p>
+      <w:pPr>
+        <w:pStyle w:val="paragraph-text"/>
+      </w:pPr>
+      <w:r>
+        <w:t xml:space="preserve">If you've checked all of these and you're still seeing the </w:t>
+      </w:r>
+      <w:r>
+        <w:rPr>
+          <w:color w:val="111111"/>
+          <w:shd w:fill="F1F1F1" w:color="auto" w:val="clear"/>
+        </w:rPr>
+        <w:t xml:space="preserve">#NAME?</w:t>
+      </w:r>
+      <w:r>
+        <w:t xml:space="preserve"> error, there might be an issue with your </w:t>
+      </w:r>
+      <w:r>
+        <w:rPr>
+          <w:color w:val="111111"/>
+          <w:shd w:fill="F1F1F1" w:color="auto" w:val="clear"/>
+        </w:rPr>
+        <w:t xml:space="preserve">xlwings</w:t>
+      </w:r>
+      <w:r>
+        <w:t xml:space="preserve"> setup. You might want to try reinstalling the </w:t>
+      </w:r>
+      <w:r>
+        <w:rPr>
+          <w:color w:val="111111"/>
+          <w:shd w:fill="F1F1F1" w:color="auto" w:val="clear"/>
+        </w:rPr>
+        <w:t xml:space="preserve">xlwings</w:t>
+      </w:r>
+      <w:r>
+        <w:t xml:space="preserve"> add-in or looking for error messages in the Python console.</w:t>
+      </w:r>
+    </w:p>
+    <w:p>
+      <w:pPr>
+        <w:pStyle w:val="paragraph-text"/>
+      </w:pPr>
+      <w:r>
+        <w:t xml:space="preserve">I hope this helps! Let me know if you have any other questions. 😊</w:t>
+      </w:r>
+    </w:p>
+    <w:p>
+      <w:pPr>
+        <w:pStyle w:val="Heading1"/>
+      </w:pPr>
+      <w:r>
+        <w:rPr>
+          <w:color w:val="005366"/>
+        </w:rPr>
+        <w:t xml:space="preserve">You</w:t>
+      </w:r>
+    </w:p>
+    <w:p>
+      <w:pPr>
+        <w:pStyle w:val="paragraph-text"/>
+      </w:pPr>
+      <w:r>
+        <w:t xml:space="preserve">See I change the name of the function to get_stock_data_yf and then tried like this:</w:t>
+      </w:r>
+    </w:p>
+    <w:p>
+      <w:pPr>
+        <w:pStyle w:val="paragraph-text"/>
+      </w:pPr>
+      <w:r>
+        <w:t xml:space="preserve">=get_stock_data_yf("ZYDUSLIFE","01/01/2018","31/12/2023")</w:t>
+      </w:r>
+    </w:p>
+    <w:p>
+      <w:pPr>
+        <w:pStyle w:val="paragraph-text"/>
+      </w:pPr>
+      <w:r>
+        <w:t xml:space="preserve">I get no data only top colume headers:</w:t>
+      </w:r>
+    </w:p>
+    <w:p>
+      <w:pPr>
+        <w:pStyle w:val="paragraph-text"/>
+      </w:pPr>
+      <w:r>
+        <w:t xml:space="preserve">Open	High	Low	Close	Adj Close	Volume</w:t>
+      </w:r>
+    </w:p>
+    <w:p>
+      <w:pPr>
+        <w:pStyle w:val="Heading1"/>
+      </w:pPr>
+      <w:r>
+        <w:rPr>
+          <w:color w:val="123BB6"/>
+        </w:rPr>
+        <w:t xml:space="preserve">Copilot</w:t>
+      </w:r>
+    </w:p>
+    <w:p>
+      <w:pPr>
+        <w:pStyle w:val="paragraph-text"/>
+      </w:pPr>
+      <w:r>
+        <w:t xml:space="preserve">The function </w:t>
+      </w:r>
+      <w:r>
+        <w:rPr>
+          <w:color w:val="111111"/>
+          <w:shd w:fill="F1F1F1" w:color="auto" w:val="clear"/>
+        </w:rPr>
+        <w:t xml:space="preserve">get_stock_data_yf</w:t>
+      </w:r>
+      <w:r>
+        <w:t xml:space="preserve"> is correctly returning the column headers, which means it's able to connect to Yahoo Finance and retrieve the data structure. However, if it's not returning any data rows, it could mean that there's no available data for the specified symbol "ZYDUSLIFE" in the date range from "01/01/2018" to "31/12/2023".</w:t>
+      </w:r>
+    </w:p>
+    <w:p>
+      <w:pPr>
+        <w:pStyle w:val="paragraph-text"/>
+      </w:pPr>
+      <w:r>
+        <w:t xml:space="preserve">Here are a few things you can check:</w:t>
+      </w:r>
+    </w:p>
+    <w:p>
+      <w:pPr>
+        <w:pStyle w:val="paragraph-text"/>
+        <w:numPr>
+          <w:ilvl w:val="0"/>
+          <w:numId w:val="5"/>
+        </w:numPr>
+      </w:pPr>
+      <w:r>
+        <w:rPr>
+          <w:b/>
+          <w:bCs/>
+        </w:rPr>
+        <w:t xml:space="preserve">Symbol</w:t>
+      </w:r>
+      <w:r>
+        <w:t xml:space="preserve">: Make sure that "ZYDUSLIFE" is the correct symbol for the stock you're interested in. Stock symbols can vary between different financial platforms, so the symbol used on one platform might not be recognized on Yahoo Finance.</w:t>
+      </w:r>
+    </w:p>
+    <w:p>
+      <w:pPr>
+        <w:pStyle w:val="paragraph-text"/>
+        <w:numPr>
+          <w:ilvl w:val="0"/>
+          <w:numId w:val="5"/>
+        </w:numPr>
+      </w:pPr>
+      <w:r>
+        <w:rPr>
+          <w:b/>
+          <w:bCs/>
+        </w:rPr>
+        <w:t xml:space="preserve">Date Range</w:t>
+      </w:r>
+      <w:r>
+        <w:t xml:space="preserve">: Check if there's available data for "ZYDUSLIFE" in the specified date range. It's possible that the stock didn't exist or wasn't publicly traded during that time.</w:t>
+      </w:r>
+    </w:p>
+    <w:p>
+      <w:pPr>
+        <w:pStyle w:val="paragraph-text"/>
+        <w:numPr>
+          <w:ilvl w:val="0"/>
+          <w:numId w:val="5"/>
+        </w:numPr>
+      </w:pPr>
+      <w:r>
+        <w:rPr>
+          <w:b/>
+          <w:bCs/>
+        </w:rPr>
+        <w:t xml:space="preserve">Data Availability</w:t>
+      </w:r>
+      <w:r>
+        <w:t xml:space="preserve">: Not all stocks have complete historical data available. It's possible that Yahoo Finance doesn't have data for "ZYDUSLIFE" for the specified date range.</w:t>
+      </w:r>
+    </w:p>
+    <w:p>
+      <w:pPr>
+        <w:pStyle w:val="paragraph-text"/>
+      </w:pPr>
+      <w:r>
+        <w:t xml:space="preserve">You can check these things manually by going to the Yahoo Finance website, searching for "ZYDUSLIFE", and looking at its historical data. If you're still having trouble, please let me know! I'm here to help. 😊</w:t>
+      </w:r>
+    </w:p>
+    <w:p>
+      <w:pPr>
+        <w:pStyle w:val="Heading1"/>
+      </w:pPr>
+      <w:r>
+        <w:rPr>
+          <w:color w:val="005366"/>
+        </w:rPr>
+        <w:t xml:space="preserve">You</w:t>
+      </w:r>
+    </w:p>
+    <w:p>
+      <w:pPr>
+        <w:pStyle w:val="paragraph-text"/>
+      </w:pPr>
+      <w:r>
+        <w:t xml:space="preserve">I traced the error - date format in which yfinance accepts the data: %Y-%m-%d:</w:t>
+      </w:r>
+    </w:p>
+    <w:p>
+      <w:pPr>
+        <w:pStyle w:val="paragraph-text"/>
+      </w:pPr>
+      <w:r>
+        <w:t xml:space="preserve">Can you give me the above code changed which converts to this format when I input like this: dd/mm/yyyy</w:t>
+      </w:r>
+    </w:p>
+    <w:p>
+      <w:pPr>
+        <w:pStyle w:val="Heading1"/>
+      </w:pPr>
+      <w:r>
+        <w:rPr>
+          <w:color w:val="123BB6"/>
+        </w:rPr>
+        <w:t xml:space="preserve">Copilot</w:t>
+      </w:r>
+    </w:p>
+    <w:p>
+      <w:pPr>
+        <w:pStyle w:val="paragraph-text"/>
+      </w:pPr>
+      <w:r>
+        <w:t xml:space="preserve">Sure, you can use Python's </w:t>
+      </w:r>
+      <w:r>
+        <w:rPr>
+          <w:color w:val="111111"/>
+          <w:shd w:fill="F1F1F1" w:color="auto" w:val="clear"/>
+        </w:rPr>
+        <w:t xml:space="preserve">datetime</w:t>
+      </w:r>
+      <w:r>
+        <w:t xml:space="preserve"> module to convert the date format from "dd/mm/yyyy" to "yyyy-mm-dd". Here's how you can modify your function to do this:</w:t>
+      </w:r>
+    </w:p>
+    <w:p>
+      <w:pPr>
+        <w:pStyle w:val="code"/>
+      </w:pPr>
+      <w:r>
+        <w:t xml:space="preserve">import datetime</w:t>
+      </w:r>
+    </w:p>
+    <w:p>
+      <w:pPr>
+        <w:pStyle w:val="code"/>
+      </w:pPr>
+      <w:r>
+        <w:t xml:space="preserve">import xlwings as xw</w:t>
+      </w:r>
+    </w:p>
+    <w:p>
+      <w:pPr>
+        <w:pStyle w:val="code"/>
+      </w:pPr>
+      <w:r>
+        <w:t xml:space="preserve">import yfinance as yf</w:t>
+      </w:r>
+    </w:p>
+    <w:p>
+      <w:pPr>
+        <w:pStyle w:val="code"/>
+      </w:pPr>
+      <w:r>
+        <w:t xml:space="preserve"/>
+      </w:r>
+    </w:p>
+    <w:p>
+      <w:pPr>
+        <w:pStyle w:val="code"/>
+      </w:pPr>
+      <w:r>
+        <w:t xml:space="preserve">@xw.func</w:t>
+      </w:r>
+    </w:p>
+    <w:p>
+      <w:pPr>
+        <w:pStyle w:val="code"/>
+      </w:pPr>
+      <w:r>
+        <w:t xml:space="preserve">def get_stock_data_yf(symbol, start_date, end_date):</w:t>
+      </w:r>
+    </w:p>
+    <w:p>
+      <w:pPr>
+        <w:pStyle w:val="code"/>
+      </w:pPr>
+      <w:r>
+        <w:t xml:space="preserve">    # Convert the date format from "dd/mm/yyyy" to "yyyy-mm-dd"</w:t>
+      </w:r>
+    </w:p>
+    <w:p>
+      <w:pPr>
+        <w:pStyle w:val="code"/>
+      </w:pPr>
+      <w:r>
+        <w:t xml:space="preserve">    start_date = datetime.datetime.strptime(start_date, "%d/%m/%Y").strftime("%Y-%m-%d")</w:t>
+      </w:r>
+    </w:p>
+    <w:p>
+      <w:pPr>
+        <w:pStyle w:val="code"/>
+      </w:pPr>
+      <w:r>
+        <w:t xml:space="preserve">    end_date = datetime.datetime.strptime(end_date, "%d/%m/%Y").strftime("%Y-%m-%d")</w:t>
+      </w:r>
+    </w:p>
+    <w:p>
+      <w:pPr>
+        <w:pStyle w:val="code"/>
+      </w:pPr>
+      <w:r>
+        <w:t xml:space="preserve"/>
+      </w:r>
+    </w:p>
+    <w:p>
+      <w:pPr>
+        <w:pStyle w:val="code"/>
+      </w:pPr>
+      <w:r>
+        <w:t xml:space="preserve">    # Download historical market data</w:t>
+      </w:r>
+    </w:p>
+    <w:p>
+      <w:pPr>
+        <w:pStyle w:val="code"/>
+      </w:pPr>
+      <w:r>
+        <w:t xml:space="preserve">    hist = yf.Ticker(symbol).history(start=start_date, end=end_date)</w:t>
+      </w:r>
+    </w:p>
+    <w:p>
+      <w:pPr>
+        <w:pStyle w:val="code"/>
+      </w:pPr>
+      <w:r>
+        <w:t xml:space="preserve"/>
+      </w:r>
+    </w:p>
+    <w:p>
+      <w:pPr>
+        <w:pStyle w:val="code"/>
+      </w:pPr>
+      <w:r>
+        <w:t xml:space="preserve">    # Prepare data for output</w:t>
+      </w:r>
+    </w:p>
+    <w:p>
+      <w:pPr>
+        <w:pStyle w:val="code"/>
+      </w:pPr>
+      <w:r>
+        <w:t xml:space="preserve">    data = [hist.columns.values.tolist()] + hist.reset_index().values.tolist()</w:t>
+      </w:r>
+    </w:p>
+    <w:p>
+      <w:pPr>
+        <w:pStyle w:val="code"/>
+      </w:pPr>
+      <w:r>
+        <w:t xml:space="preserve"/>
+      </w:r>
+    </w:p>
+    <w:p>
+      <w:pPr>
+        <w:pStyle w:val="code"/>
+      </w:pPr>
+      <w:r>
+        <w:t xml:space="preserve">    return data</w:t>
+      </w:r>
+    </w:p>
+    <w:p>
+      <w:pPr>
+        <w:pStyle w:val="paragraph-text"/>
+      </w:pPr>
+      <w:r>
+        <w:t xml:space="preserve">In this function, </w:t>
+      </w:r>
+      <w:r>
+        <w:rPr>
+          <w:color w:val="111111"/>
+          <w:shd w:fill="F1F1F1" w:color="auto" w:val="clear"/>
+        </w:rPr>
+        <w:t xml:space="preserve">datetime.datetime.strptime(start_date, "%d/%m/%Y").strftime("%Y-%m-%d")</w:t>
+      </w:r>
+      <w:r>
+        <w:t xml:space="preserve"> converts the start date from "dd/mm/yyyy" to "yyyy-mm-dd". The same is done for the end date.</w:t>
+      </w:r>
+    </w:p>
+    <w:p>
+      <w:pPr>
+        <w:pStyle w:val="paragraph-text"/>
+      </w:pPr>
+      <w:r>
+        <w:t xml:space="preserve">You can call this function from Excel using the formula </w:t>
+      </w:r>
+      <w:r>
+        <w:rPr>
+          <w:color w:val="111111"/>
+          <w:shd w:fill="F1F1F1" w:color="auto" w:val="clear"/>
+        </w:rPr>
+        <w:t xml:space="preserve">=get_stock_data_yf(symbol, start_date, end_date)</w:t>
+      </w:r>
+      <w:r>
+        <w:t xml:space="preserve">. Replace </w:t>
+      </w:r>
+      <w:r>
+        <w:rPr>
+          <w:color w:val="111111"/>
+          <w:shd w:fill="F1F1F1" w:color="auto" w:val="clear"/>
+        </w:rPr>
+        <w:t xml:space="preserve">symbol</w:t>
+      </w:r>
+      <w:r>
+        <w:t xml:space="preserve">, </w:t>
+      </w:r>
+      <w:r>
+        <w:rPr>
+          <w:color w:val="111111"/>
+          <w:shd w:fill="F1F1F1" w:color="auto" w:val="clear"/>
+        </w:rPr>
+        <w:t xml:space="preserve">start_date</w:t>
+      </w:r>
+      <w:r>
+        <w:t xml:space="preserve">, and </w:t>
+      </w:r>
+      <w:r>
+        <w:rPr>
+          <w:color w:val="111111"/>
+          <w:shd w:fill="F1F1F1" w:color="auto" w:val="clear"/>
+        </w:rPr>
+        <w:t xml:space="preserve">end_date</w:t>
+      </w:r>
+      <w:r>
+        <w:t xml:space="preserve"> with the actual values or cell references.</w:t>
+      </w:r>
+    </w:p>
+    <w:p>
+      <w:pPr>
+        <w:pStyle w:val="paragraph-text"/>
+      </w:pPr>
+      <w:r>
+        <w:t xml:space="preserve">Please note that the dates should be in the format 'dd/mm/yyyy'. Also, you need to install the </w:t>
+      </w:r>
+      <w:r>
+        <w:rPr>
+          <w:color w:val="111111"/>
+          <w:shd w:fill="F1F1F1" w:color="auto" w:val="clear"/>
+        </w:rPr>
+        <w:t xml:space="preserve">yfinance</w:t>
+      </w:r>
+      <w:r>
+        <w:t xml:space="preserve"> library if you haven't already. You can install it using pip:</w:t>
+      </w:r>
+    </w:p>
+    <w:p>
+      <w:pPr>
+        <w:pStyle w:val="code"/>
+      </w:pPr>
+      <w:r>
+        <w:t xml:space="preserve">pip install yfinance</w:t>
+      </w:r>
+    </w:p>
+    <w:p>
+      <w:pPr>
+        <w:pStyle w:val="paragraph-text"/>
+      </w:pPr>
+      <w:r>
+        <w:t xml:space="preserve">I hope this helps! Let me know if you have any other questions. 😊</w:t>
+      </w:r>
+    </w:p>
+    <w:p>
+      <w:pPr>
+        <w:pStyle w:val="paragraph-text"/>
+        <w:pBdr>
+          <w:top w:val="single" w:color="d9d9d9" w:sz="8" w:space="10"/>
+        </w:pBdr>
+      </w:pPr>
+      <w:r>
+        <w:t xml:space="preserve">Source(s)</w:t>
+      </w:r>
+    </w:p>
+    <w:p>
+      <w:pPr>
+        <w:pStyle w:val="citation"/>
+      </w:pPr>
+      <w:r>
+        <w:t xml:space="preserve">1. </w:t>
+      </w:r>
+      <w:hyperlink w:history="1" r:id="rIdyjtlisltw22prmnmcxohg">
+        <w:r>
+          <w:rPr>
+            <w:rStyle w:val="Hyperlink"/>
+          </w:rPr>
+          <w:t xml:space="preserve">github.com</w:t>
+        </w:r>
+      </w:hyperlink>
+    </w:p>
+    <w:p>
+      <w:pPr>
+        <w:pStyle w:val="paragraph-text"/>
+      </w:pPr>
+    </w:p>
+    <w:p>
+      <w:pPr>
+        <w:pStyle w:val="Heading1"/>
+      </w:pPr>
+      <w:r>
+        <w:rPr>
+          <w:color w:val="005366"/>
+        </w:rPr>
+        <w:t xml:space="preserve">You</w:t>
+      </w:r>
+    </w:p>
+    <w:p>
+      <w:pPr>
+        <w:pStyle w:val="paragraph-text"/>
+      </w:pPr>
+      <w:r>
+        <w:t xml:space="preserve">Error traceback is:</w:t>
+      </w:r>
+    </w:p>
+    <w:p>
+      <w:pPr>
+        <w:pStyle w:val="paragraph-text"/>
+      </w:pPr>
+      <w:r>
+        <w:t xml:space="preserve">"Exception: All elements of a 2d list or tuple must be of the same length
+raise Exception(
+File ""D:\Programs\Python\Lib\site-packages\xlwings\conversion_</w:t>
+      </w:r>
+      <w:r>
+        <w:rPr>
+          <w:i/>
+          <w:iCs/>
+        </w:rPr>
+        <w:t xml:space="preserve">init</w:t>
+      </w:r>
+      <w:r>
+        <w:t xml:space="preserve">_.py"", line 94, in write
+^^^^^^^^^^^^^^^^^^^^^^^^^^^^^^^^^^^^^^^^^^^^^^^^
+xl_result = conversion.write(ret, None, ret_info[""options""])
+File ""D:\Programs\Python\Lib\site-packages\xlwings\udfs.py"", line 504, in call_udf
+^^^^^^^^^^^^^^^^^^^^^^^^^^^^^^^^^^^^^^^^^^^^^^^^^^^^^^^^^^^^^^^^^
+res = call_udf(script, fname, args, this_workbook, FromVariant(caller))
+File ""D:\Programs\Python\Lib\site-packages\xlwings\com_server.py"", line 235, in CallUDF
+^^^^^^^^^^^
+return func(*args)
+File ""D:\Programs\Python\Lib\site-packages\win32com\server\policy.py"", line 639, in </w:t>
+      </w:r>
+      <w:r>
+        <w:rPr>
+          <w:i/>
+          <w:iCs/>
+        </w:rPr>
+        <w:t xml:space="preserve">invokeex</w:t>
+      </w:r>
+      <w:r>
+        <w:t xml:space="preserve">
+^^^^^^^^^^^^^^^^^^^^^^^^^^^^^^^^^^^^^^^^^^^^^^^^^^^^^^^
+return S_OK, -1, self.</w:t>
+      </w:r>
+      <w:r>
+        <w:rPr>
+          <w:i/>
+          <w:iCs/>
+        </w:rPr>
+        <w:t xml:space="preserve">invokeex</w:t>
+      </w:r>
+      <w:r>
+        <w:t xml:space="preserve">(dispid, lcid, wFlags, args, None, None)
+File ""D:\Programs\Python\Lib\site-packages\win32com\server\policy.py"", line 310, in </w:t>
+      </w:r>
+      <w:r>
+        <w:rPr>
+          <w:i/>
+          <w:iCs/>
+        </w:rPr>
+        <w:t xml:space="preserve">invoke</w:t>
+      </w:r>
+      <w:r>
+        <w:t xml:space="preserve">
+^^^^^^^^^^^^^^^^^^^^^^^^^^^^^^^^^^^^^^^^^
+return self.</w:t>
+      </w:r>
+      <w:r>
+        <w:rPr>
+          <w:i/>
+          <w:iCs/>
+        </w:rPr>
+        <w:t xml:space="preserve">invoke</w:t>
+      </w:r>
+      <w:r>
+        <w:t xml:space="preserve">(dispid, lcid, wFlags, args)
+File ""D:\Programs\Python\Lib\site-packages\win32com\server\policy.py"", line 305, in </w:t>
+      </w:r>
+      <w:r>
+        <w:rPr>
+          <w:i/>
+          <w:iCs/>
+        </w:rPr>
+        <w:t xml:space="preserve">Invoke</w:t>
+      </w:r>
+      <w:r>
+        <w:t xml:space="preserve">"</w:t>
+      </w:r>
+    </w:p>
+    <w:p>
+      <w:pPr>
+        <w:pStyle w:val="Heading1"/>
+      </w:pPr>
+      <w:r>
+        <w:rPr>
+          <w:color w:val="123BB6"/>
+        </w:rPr>
+        <w:t xml:space="preserve">Copilot</w:t>
+      </w:r>
+    </w:p>
+    <w:p>
+      <w:pPr>
+        <w:pStyle w:val="paragraph-text"/>
+      </w:pPr>
+      <w:r>
+        <w:t xml:space="preserve">The error message </w:t>
+      </w:r>
+      <w:r>
+        <w:rPr>
+          <w:color w:val="111111"/>
+          <w:shd w:fill="F1F1F1" w:color="auto" w:val="clear"/>
+        </w:rPr>
+        <w:t xml:space="preserve">Exception: All elements of a 2d list or tuple must be of the same length</w:t>
+      </w:r>
+      <w:r>
+        <w:t xml:space="preserve"> is raised when the function returns a list of lists (a 2D list or matrix) where not all inner lists have the same length. This can happen when you're trying to write this data to an Excel range, as Excel requires that all rows in the range have the same number of columns.</w:t>
+      </w:r>
+    </w:p>
+    <w:p>
+      <w:pPr>
+        <w:pStyle w:val="paragraph-text"/>
+      </w:pPr>
+      <w:r>
+        <w:t xml:space="preserve">In the context of your function, this error could be caused by missing data for some dates. When the </w:t>
+      </w:r>
+      <w:r>
+        <w:rPr>
+          <w:color w:val="111111"/>
+          <w:shd w:fill="F1F1F1" w:color="auto" w:val="clear"/>
+        </w:rPr>
+        <w:t xml:space="preserve">yfinance</w:t>
+      </w:r>
+      <w:r>
+        <w:t xml:space="preserve"> library downloads historical market data, it might not return data for every single day in the specified date range. For example, stock markets are closed on weekends and holidays, so there won't be any data for these days. If the data for a particular day is missing, </w:t>
+      </w:r>
+      <w:r>
+        <w:rPr>
+          <w:color w:val="111111"/>
+          <w:shd w:fill="F1F1F1" w:color="auto" w:val="clear"/>
+        </w:rPr>
+        <w:t xml:space="preserve">yfinance</w:t>
+      </w:r>
+      <w:r>
+        <w:t xml:space="preserve"> will simply skip that day, which could result in rows with missing values.</w:t>
+      </w:r>
+    </w:p>
+    <w:p>
+      <w:pPr>
+        <w:pStyle w:val="paragraph-text"/>
+      </w:pPr>
+      <w:r>
+        <w:t xml:space="preserve">To fix this issue, you can modify your function to fill in missing dates with </w:t>
+      </w:r>
+      <w:r>
+        <w:rPr>
+          <w:color w:val="111111"/>
+          <w:shd w:fill="F1F1F1" w:color="auto" w:val="clear"/>
+        </w:rPr>
+        <w:t xml:space="preserve">None</w:t>
+      </w:r>
+      <w:r>
+        <w:t xml:space="preserve"> or some other placeholder value. However, this might complicate your function and make the data harder to interpret.</w:t>
+      </w:r>
+    </w:p>
+    <w:p>
+      <w:pPr>
+        <w:pStyle w:val="paragraph-text"/>
+      </w:pPr>
+      <w:r>
+        <w:t xml:space="preserve">A simpler solution would be to drop any rows with missing values before returning the data. Here's how you can modify your function to do this:</w:t>
+      </w:r>
+    </w:p>
+    <w:p>
+      <w:pPr>
+        <w:pStyle w:val="code"/>
+      </w:pPr>
+      <w:r>
+        <w:t xml:space="preserve">import pandas as pd</w:t>
+      </w:r>
+    </w:p>
+    <w:p>
+      <w:pPr>
+        <w:pStyle w:val="code"/>
+      </w:pPr>
+      <w:r>
+        <w:t xml:space="preserve">import xlwings as xw</w:t>
+      </w:r>
+    </w:p>
+    <w:p>
+      <w:pPr>
+        <w:pStyle w:val="code"/>
+      </w:pPr>
+      <w:r>
+        <w:t xml:space="preserve">import yfinance as yf</w:t>
+      </w:r>
+    </w:p>
+    <w:p>
+      <w:pPr>
+        <w:pStyle w:val="code"/>
+      </w:pPr>
+      <w:r>
+        <w:t xml:space="preserve"/>
+      </w:r>
+    </w:p>
+    <w:p>
+      <w:pPr>
+        <w:pStyle w:val="code"/>
+      </w:pPr>
+      <w:r>
+        <w:t xml:space="preserve">@xw.func</w:t>
+      </w:r>
+    </w:p>
+    <w:p>
+      <w:pPr>
+        <w:pStyle w:val="code"/>
+      </w:pPr>
+      <w:r>
+        <w:t xml:space="preserve">def get_stock_data_yf(symbol, start_date, end_date):</w:t>
+      </w:r>
+    </w:p>
+    <w:p>
+      <w:pPr>
+        <w:pStyle w:val="code"/>
+      </w:pPr>
+      <w:r>
+        <w:t xml:space="preserve">    # Convert the date format from "dd/mm/yyyy" to "yyyy-mm-dd"</w:t>
+      </w:r>
+    </w:p>
+    <w:p>
+      <w:pPr>
+        <w:pStyle w:val="code"/>
+      </w:pPr>
+      <w:r>
+        <w:t xml:space="preserve">    start_date = datetime.datetime.strptime(start_date, "%d/%m/%Y").strftime("%Y-%m-%d")</w:t>
+      </w:r>
+    </w:p>
+    <w:p>
+      <w:pPr>
+        <w:pStyle w:val="code"/>
+      </w:pPr>
+      <w:r>
+        <w:t xml:space="preserve">    end_date = datetime.datetime.strptime(end_date, "%d/%m/%Y").strftime("%Y-%m-%d")</w:t>
+      </w:r>
+    </w:p>
+    <w:p>
+      <w:pPr>
+        <w:pStyle w:val="code"/>
+      </w:pPr>
+      <w:r>
+        <w:t xml:space="preserve"/>
+      </w:r>
+    </w:p>
+    <w:p>
+      <w:pPr>
+        <w:pStyle w:val="code"/>
+      </w:pPr>
+      <w:r>
+        <w:t xml:space="preserve">    # Download historical market data</w:t>
+      </w:r>
+    </w:p>
+    <w:p>
+      <w:pPr>
+        <w:pStyle w:val="code"/>
+      </w:pPr>
+      <w:r>
+        <w:t xml:space="preserve">    hist = yf.Ticker(symbol).history(start=start_date, end=end_date)</w:t>
+      </w:r>
+    </w:p>
+    <w:p>
+      <w:pPr>
+        <w:pStyle w:val="code"/>
+      </w:pPr>
+      <w:r>
+        <w:t xml:space="preserve"/>
+      </w:r>
+    </w:p>
+    <w:p>
+      <w:pPr>
+        <w:pStyle w:val="code"/>
+      </w:pPr>
+      <w:r>
+        <w:t xml:space="preserve">    # Drop rows with missing values</w:t>
+      </w:r>
+    </w:p>
+    <w:p>
+      <w:pPr>
+        <w:pStyle w:val="code"/>
+      </w:pPr>
+      <w:r>
+        <w:t xml:space="preserve">    hist.dropna(inplace=True)</w:t>
+      </w:r>
+    </w:p>
+    <w:p>
+      <w:pPr>
+        <w:pStyle w:val="code"/>
+      </w:pPr>
+      <w:r>
+        <w:t xml:space="preserve"/>
+      </w:r>
+    </w:p>
+    <w:p>
+      <w:pPr>
+        <w:pStyle w:val="code"/>
+      </w:pPr>
+      <w:r>
+        <w:t xml:space="preserve">    # Prepare data for output</w:t>
+      </w:r>
+    </w:p>
+    <w:p>
+      <w:pPr>
+        <w:pStyle w:val="code"/>
+      </w:pPr>
+      <w:r>
+        <w:t xml:space="preserve">    data = [hist.columns.values.tolist()] + hist.reset_index().values.tolist()</w:t>
+      </w:r>
+    </w:p>
+    <w:p>
+      <w:pPr>
+        <w:pStyle w:val="code"/>
+      </w:pPr>
+      <w:r>
+        <w:t xml:space="preserve"/>
+      </w:r>
+    </w:p>
+    <w:p>
+      <w:pPr>
+        <w:pStyle w:val="code"/>
+      </w:pPr>
+      <w:r>
+        <w:t xml:space="preserve">    return data</w:t>
+      </w:r>
+    </w:p>
+    <w:p>
+      <w:pPr>
+        <w:pStyle w:val="paragraph-text"/>
+      </w:pPr>
+      <w:r>
+        <w:t xml:space="preserve">In this modified function, </w:t>
+      </w:r>
+      <w:r>
+        <w:rPr>
+          <w:color w:val="111111"/>
+          <w:shd w:fill="F1F1F1" w:color="auto" w:val="clear"/>
+        </w:rPr>
+        <w:t xml:space="preserve">hist.dropna(inplace=True)</w:t>
+      </w:r>
+      <w:r>
+        <w:t xml:space="preserve"> removes any rows in the DataFrame that contain </w:t>
+      </w:r>
+      <w:r>
+        <w:rPr>
+          <w:color w:val="111111"/>
+          <w:shd w:fill="F1F1F1" w:color="auto" w:val="clear"/>
+        </w:rPr>
+        <w:t xml:space="preserve">NaN</w:t>
+      </w:r>
+      <w:r>
+        <w:t xml:space="preserve"> values. This should ensure that all rows in the output data have the same length.</w:t>
+      </w:r>
+    </w:p>
+    <w:p>
+      <w:pPr>
+        <w:pStyle w:val="paragraph-text"/>
+      </w:pPr>
+      <w:r>
+        <w:t xml:space="preserve">I hope this helps! Let me know if you have any other questions. 😊</w:t>
+      </w:r>
+    </w:p>
+    <w:p>
+      <w:pPr>
+        <w:pStyle w:val="paragraph-text"/>
+        <w:pBdr>
+          <w:top w:val="single" w:color="d9d9d9" w:sz="8" w:space="10"/>
+        </w:pBdr>
+      </w:pPr>
+      <w:r>
+        <w:t xml:space="preserve">Source(s)</w:t>
+      </w:r>
+    </w:p>
+    <w:p>
+      <w:pPr>
+        <w:pStyle w:val="citation"/>
+      </w:pPr>
+      <w:r>
+        <w:t xml:space="preserve">1. </w:t>
+      </w:r>
+      <w:hyperlink w:history="1" r:id="rIdro74nwvy7kkg1s2posbf5">
+        <w:r>
+          <w:rPr>
+            <w:rStyle w:val="Hyperlink"/>
+          </w:rPr>
+          <w:t xml:space="preserve">github.com</w:t>
+        </w:r>
+      </w:hyperlink>
+    </w:p>
+    <w:p>
+      <w:pPr>
+        <w:pStyle w:val="paragraph-text"/>
+      </w:pPr>
+    </w:p>
+    <w:p>
+      <w:pPr>
+        <w:pStyle w:val="Heading1"/>
+      </w:pPr>
+      <w:r>
+        <w:rPr>
+          <w:color w:val="005366"/>
+        </w:rPr>
+        <w:t xml:space="preserve">You</w:t>
+      </w:r>
+    </w:p>
+    <w:p>
+      <w:pPr>
+        <w:pStyle w:val="paragraph-text"/>
+      </w:pPr>
+      <w:r>
+        <w:t xml:space="preserve">Why pandas? Use numpy.</w:t>
+      </w:r>
+    </w:p>
+    <w:p>
+      <w:pPr>
+        <w:pStyle w:val="Heading1"/>
+      </w:pPr>
+      <w:r>
+        <w:rPr>
+          <w:color w:val="123BB6"/>
+        </w:rPr>
+        <w:t xml:space="preserve">Copilot</w:t>
+      </w:r>
+    </w:p>
+    <w:p>
+      <w:pPr>
+        <w:pStyle w:val="paragraph-text"/>
+      </w:pPr>
+      <w:r>
+        <w:t xml:space="preserve">Sure, you can use </w:t>
+      </w:r>
+      <w:r>
+        <w:rPr>
+          <w:color w:val="111111"/>
+          <w:shd w:fill="F1F1F1" w:color="auto" w:val="clear"/>
+        </w:rPr>
+        <w:t xml:space="preserve">numpy</w:t>
+      </w:r>
+      <w:r>
+        <w:t xml:space="preserve"> instead of </w:t>
+      </w:r>
+      <w:r>
+        <w:rPr>
+          <w:color w:val="111111"/>
+          <w:shd w:fill="F1F1F1" w:color="auto" w:val="clear"/>
+        </w:rPr>
+        <w:t xml:space="preserve">pandas</w:t>
+      </w:r>
+      <w:r>
+        <w:t xml:space="preserve"> to handle the data. However, please note that </w:t>
+      </w:r>
+      <w:r>
+        <w:rPr>
+          <w:color w:val="111111"/>
+          <w:shd w:fill="F1F1F1" w:color="auto" w:val="clear"/>
+        </w:rPr>
+        <w:t xml:space="preserve">yfinance</w:t>
+      </w:r>
+      <w:r>
+        <w:t xml:space="preserve"> returns data in a </w:t>
+      </w:r>
+      <w:r>
+        <w:rPr>
+          <w:color w:val="111111"/>
+          <w:shd w:fill="F1F1F1" w:color="auto" w:val="clear"/>
+        </w:rPr>
+        <w:t xml:space="preserve">pandas</w:t>
+      </w:r>
+      <w:r>
+        <w:t xml:space="preserve"> DataFrame, which is a more high-level data structure and provides more functionalities for data manipulation compared to </w:t>
+      </w:r>
+      <w:r>
+        <w:rPr>
+          <w:color w:val="111111"/>
+          <w:shd w:fill="F1F1F1" w:color="auto" w:val="clear"/>
+        </w:rPr>
+        <w:t xml:space="preserve">numpy</w:t>
+      </w:r>
+      <w:r>
+        <w:t xml:space="preserve"> arrays.</w:t>
+      </w:r>
+    </w:p>
+    <w:p>
+      <w:pPr>
+        <w:pStyle w:val="paragraph-text"/>
+      </w:pPr>
+      <w:r>
+        <w:t xml:space="preserve">If you still prefer to use </w:t>
+      </w:r>
+      <w:r>
+        <w:rPr>
+          <w:color w:val="111111"/>
+          <w:shd w:fill="F1F1F1" w:color="auto" w:val="clear"/>
+        </w:rPr>
+        <w:t xml:space="preserve">numpy</w:t>
+      </w:r>
+      <w:r>
+        <w:t xml:space="preserve">, you can convert the DataFrame to a </w:t>
+      </w:r>
+      <w:r>
+        <w:rPr>
+          <w:color w:val="111111"/>
+          <w:shd w:fill="F1F1F1" w:color="auto" w:val="clear"/>
+        </w:rPr>
+        <w:t xml:space="preserve">numpy</w:t>
+      </w:r>
+      <w:r>
+        <w:t xml:space="preserve"> array. Here's how you can modify your function:</w:t>
+      </w:r>
+    </w:p>
+    <w:p>
+      <w:pPr>
+        <w:pStyle w:val="code"/>
+      </w:pPr>
+      <w:r>
+        <w:t xml:space="preserve">import datetime</w:t>
+      </w:r>
+    </w:p>
+    <w:p>
+      <w:pPr>
+        <w:pStyle w:val="code"/>
+      </w:pPr>
+      <w:r>
+        <w:t xml:space="preserve">import xlwings as xw</w:t>
+      </w:r>
+    </w:p>
+    <w:p>
+      <w:pPr>
+        <w:pStyle w:val="code"/>
+      </w:pPr>
+      <w:r>
+        <w:t xml:space="preserve">import yfinance as yf</w:t>
+      </w:r>
+    </w:p>
+    <w:p>
+      <w:pPr>
+        <w:pStyle w:val="code"/>
+      </w:pPr>
+      <w:r>
+        <w:t xml:space="preserve">import numpy as np</w:t>
+      </w:r>
+    </w:p>
+    <w:p>
+      <w:pPr>
+        <w:pStyle w:val="code"/>
+      </w:pPr>
+      <w:r>
+        <w:t xml:space="preserve"/>
+      </w:r>
+    </w:p>
+    <w:p>
+      <w:pPr>
+        <w:pStyle w:val="code"/>
+      </w:pPr>
+      <w:r>
+        <w:t xml:space="preserve">@xw.func</w:t>
+      </w:r>
+    </w:p>
+    <w:p>
+      <w:pPr>
+        <w:pStyle w:val="code"/>
+      </w:pPr>
+      <w:r>
+        <w:t xml:space="preserve">def get_stock_data_yf(symbol, start_date, end_date):</w:t>
+      </w:r>
+    </w:p>
+    <w:p>
+      <w:pPr>
+        <w:pStyle w:val="code"/>
+      </w:pPr>
+      <w:r>
+        <w:t xml:space="preserve">    # Convert the date format from "dd/mm/yyyy" to "yyyy-mm-dd"</w:t>
+      </w:r>
+    </w:p>
+    <w:p>
+      <w:pPr>
+        <w:pStyle w:val="code"/>
+      </w:pPr>
+      <w:r>
+        <w:t xml:space="preserve">    start_date = datetime.datetime.strptime(start_date, "%d/%m/%Y").strftime("%Y-%m-%d")</w:t>
+      </w:r>
+    </w:p>
+    <w:p>
+      <w:pPr>
+        <w:pStyle w:val="code"/>
+      </w:pPr>
+      <w:r>
+        <w:t xml:space="preserve">    end_date = datetime.datetime.strptime(end_date, "%d/%m/%Y").strftime("%Y-%m-%d")</w:t>
+      </w:r>
+    </w:p>
+    <w:p>
+      <w:pPr>
+        <w:pStyle w:val="code"/>
+      </w:pPr>
+      <w:r>
+        <w:t xml:space="preserve"/>
+      </w:r>
+    </w:p>
+    <w:p>
+      <w:pPr>
+        <w:pStyle w:val="code"/>
+      </w:pPr>
+      <w:r>
+        <w:t xml:space="preserve">    # Download historical market data</w:t>
+      </w:r>
+    </w:p>
+    <w:p>
+      <w:pPr>
+        <w:pStyle w:val="code"/>
+      </w:pPr>
+      <w:r>
+        <w:t xml:space="preserve">    hist = yf.Ticker(symbol).history(start=start_date, end=end_date)</w:t>
+      </w:r>
+    </w:p>
+    <w:p>
+      <w:pPr>
+        <w:pStyle w:val="code"/>
+      </w:pPr>
+      <w:r>
+        <w:t xml:space="preserve"/>
+      </w:r>
+    </w:p>
+    <w:p>
+      <w:pPr>
+        <w:pStyle w:val="code"/>
+      </w:pPr>
+      <w:r>
+        <w:t xml:space="preserve">    # Convert DataFrame to numpy array</w:t>
+      </w:r>
+    </w:p>
+    <w:p>
+      <w:pPr>
+        <w:pStyle w:val="code"/>
+      </w:pPr>
+      <w:r>
+        <w:t xml:space="preserve">    data_array = hist.to_numpy()</w:t>
+      </w:r>
+    </w:p>
+    <w:p>
+      <w:pPr>
+        <w:pStyle w:val="code"/>
+      </w:pPr>
+      <w:r>
+        <w:t xml:space="preserve"/>
+      </w:r>
+    </w:p>
+    <w:p>
+      <w:pPr>
+        <w:pStyle w:val="code"/>
+      </w:pPr>
+      <w:r>
+        <w:t xml:space="preserve">    # Prepare data for output</w:t>
+      </w:r>
+    </w:p>
+    <w:p>
+      <w:pPr>
+        <w:pStyle w:val="code"/>
+      </w:pPr>
+      <w:r>
+        <w:t xml:space="preserve">    data = [hist.columns.values.tolist()] + data_array.tolist()</w:t>
+      </w:r>
+    </w:p>
+    <w:p>
+      <w:pPr>
+        <w:pStyle w:val="code"/>
+      </w:pPr>
+      <w:r>
+        <w:t xml:space="preserve"/>
+      </w:r>
+    </w:p>
+    <w:p>
+      <w:pPr>
+        <w:pStyle w:val="code"/>
+      </w:pPr>
+      <w:r>
+        <w:t xml:space="preserve">    return data</w:t>
+      </w:r>
+    </w:p>
+    <w:p>
+      <w:pPr>
+        <w:pStyle w:val="paragraph-text"/>
+      </w:pPr>
+      <w:r>
+        <w:t xml:space="preserve">In this modified function, </w:t>
+      </w:r>
+      <w:r>
+        <w:rPr>
+          <w:color w:val="111111"/>
+          <w:shd w:fill="F1F1F1" w:color="auto" w:val="clear"/>
+        </w:rPr>
+        <w:t xml:space="preserve">hist.to_numpy()</w:t>
+      </w:r>
+      <w:r>
+        <w:t xml:space="preserve"> converts the DataFrame to a </w:t>
+      </w:r>
+      <w:r>
+        <w:rPr>
+          <w:color w:val="111111"/>
+          <w:shd w:fill="F1F1F1" w:color="auto" w:val="clear"/>
+        </w:rPr>
+        <w:t xml:space="preserve">numpy</w:t>
+      </w:r>
+      <w:r>
+        <w:t xml:space="preserve"> array. Please note that this will only include the data values, not the index or column labels of the DataFrame. The column labels are added separately to the output data.</w:t>
+      </w:r>
+    </w:p>
+    <w:p>
+      <w:pPr>
+        <w:pStyle w:val="paragraph-text"/>
+      </w:pPr>
+      <w:r>
+        <w:t xml:space="preserve">I hope this helps! Let me know if you have any other questions. 😊</w:t>
+      </w:r>
+    </w:p>
+    <w:p>
+      <w:pPr>
+        <w:pStyle w:val="paragraph-text"/>
+        <w:pBdr>
+          <w:top w:val="single" w:color="d9d9d9" w:sz="8" w:space="10"/>
+        </w:pBdr>
+      </w:pPr>
+      <w:r>
+        <w:t xml:space="preserve">Source(s)</w:t>
+      </w:r>
+    </w:p>
+    <w:p>
+      <w:pPr>
+        <w:pStyle w:val="citation"/>
+      </w:pPr>
+      <w:r>
+        <w:t xml:space="preserve">1. </w:t>
+      </w:r>
+      <w:hyperlink w:history="1" r:id="rIdvui2gilgjswozpdsci2rg">
+        <w:r>
+          <w:rPr>
+            <w:rStyle w:val="Hyperlink"/>
+          </w:rPr>
+          <w:t xml:space="preserve">github.com</w:t>
+        </w:r>
+      </w:hyperlink>
+    </w:p>
+    <w:p>
+      <w:pPr>
+        <w:pStyle w:val="paragraph-text"/>
+      </w:pPr>
+    </w:p>
+    <w:p>
+      <w:pPr>
+        <w:pStyle w:val="Heading1"/>
+      </w:pPr>
+      <w:r>
+        <w:rPr>
+          <w:color w:val="005366"/>
+        </w:rPr>
+        <w:t xml:space="preserve">You</w:t>
+      </w:r>
+    </w:p>
+    <w:p>
+      <w:pPr>
+        <w:pStyle w:val="paragraph-text"/>
+      </w:pPr>
+      <w:r>
+        <w:t xml:space="preserve">Suppose I want to test yfinance directly in python, can you give me how to directly use yfinance without python UDF style.</w:t>
+      </w:r>
+    </w:p>
+    <w:p>
+      <w:pPr>
+        <w:pStyle w:val="Heading1"/>
+      </w:pPr>
+      <w:r>
+        <w:rPr>
+          <w:color w:val="123BB6"/>
+        </w:rPr>
+        <w:t xml:space="preserve">Copilot</w:t>
+      </w:r>
+    </w:p>
+    <w:p>
+      <w:pPr>
+        <w:pStyle w:val="paragraph-text"/>
+      </w:pPr>
+      <w:r>
+        <w:t xml:space="preserve">Sure, you can use </w:t>
+      </w:r>
+      <w:r>
+        <w:rPr>
+          <w:color w:val="111111"/>
+          <w:shd w:fill="F1F1F1" w:color="auto" w:val="clear"/>
+        </w:rPr>
+        <w:t xml:space="preserve">yfinance</w:t>
+      </w:r>
+      <w:r>
+        <w:t xml:space="preserve"> directly in a Python script to download historical market data. Here's an example:</w:t>
+      </w:r>
+    </w:p>
+    <w:p>
+      <w:pPr>
+        <w:pStyle w:val="code"/>
+      </w:pPr>
+      <w:r>
+        <w:t xml:space="preserve">import yfinance as yf</w:t>
+      </w:r>
+    </w:p>
+    <w:p>
+      <w:pPr>
+        <w:pStyle w:val="code"/>
+      </w:pPr>
+      <w:r>
+        <w:t xml:space="preserve"/>
+      </w:r>
+    </w:p>
+    <w:p>
+      <w:pPr>
+        <w:pStyle w:val="code"/>
+      </w:pPr>
+      <w:r>
+        <w:t xml:space="preserve"># Define the ticker symbol</w:t>
+      </w:r>
+    </w:p>
+    <w:p>
+      <w:pPr>
+        <w:pStyle w:val="code"/>
+      </w:pPr>
+      <w:r>
+        <w:t xml:space="preserve">symbol = "AAPL"</w:t>
+      </w:r>
+    </w:p>
+    <w:p>
+      <w:pPr>
+        <w:pStyle w:val="code"/>
+      </w:pPr>
+      <w:r>
+        <w:t xml:space="preserve"/>
+      </w:r>
+    </w:p>
+    <w:p>
+      <w:pPr>
+        <w:pStyle w:val="code"/>
+      </w:pPr>
+      <w:r>
+        <w:t xml:space="preserve"># Get data on this ticker</w:t>
+      </w:r>
+    </w:p>
+    <w:p>
+      <w:pPr>
+        <w:pStyle w:val="code"/>
+      </w:pPr>
+      <w:r>
+        <w:t xml:space="preserve">tickerData = yf.Ticker(symbol)</w:t>
+      </w:r>
+    </w:p>
+    <w:p>
+      <w:pPr>
+        <w:pStyle w:val="code"/>
+      </w:pPr>
+      <w:r>
+        <w:t xml:space="preserve"/>
+      </w:r>
+    </w:p>
+    <w:p>
+      <w:pPr>
+        <w:pStyle w:val="code"/>
+      </w:pPr>
+      <w:r>
+        <w:t xml:space="preserve"># Get the historical prices for this ticker</w:t>
+      </w:r>
+    </w:p>
+    <w:p>
+      <w:pPr>
+        <w:pStyle w:val="code"/>
+      </w:pPr>
+      <w:r>
+        <w:t xml:space="preserve">tickerDf = tickerData.history(period='1d', start='2020-1-1', end='2020-12-31')</w:t>
+      </w:r>
+    </w:p>
+    <w:p>
+      <w:pPr>
+        <w:pStyle w:val="code"/>
+      </w:pPr>
+      <w:r>
+        <w:t xml:space="preserve"/>
+      </w:r>
+    </w:p>
+    <w:p>
+      <w:pPr>
+        <w:pStyle w:val="code"/>
+      </w:pPr>
+      <w:r>
+        <w:t xml:space="preserve"># See your data</w:t>
+      </w:r>
+    </w:p>
+    <w:p>
+      <w:pPr>
+        <w:pStyle w:val="code"/>
+      </w:pPr>
+      <w:r>
+        <w:t xml:space="preserve">print(tickerDf)</w:t>
+      </w:r>
+    </w:p>
+    <w:p>
+      <w:pPr>
+        <w:pStyle w:val="paragraph-text"/>
+      </w:pPr>
+      <w:r>
+        <w:t xml:space="preserve">In this script, </w:t>
+      </w:r>
+      <w:r>
+        <w:rPr>
+          <w:color w:val="111111"/>
+          <w:shd w:fill="F1F1F1" w:color="auto" w:val="clear"/>
+        </w:rPr>
+        <w:t xml:space="preserve">yf.Ticker(symbol)</w:t>
+      </w:r>
+      <w:r>
+        <w:t xml:space="preserve"> creates a </w:t>
+      </w:r>
+      <w:r>
+        <w:rPr>
+          <w:color w:val="111111"/>
+          <w:shd w:fill="F1F1F1" w:color="auto" w:val="clear"/>
+        </w:rPr>
+        <w:t xml:space="preserve">Ticker</w:t>
+      </w:r>
+      <w:r>
+        <w:t xml:space="preserve"> object for the specified symbol. </w:t>
+      </w:r>
+      <w:r>
+        <w:rPr>
+          <w:color w:val="111111"/>
+          <w:shd w:fill="F1F1F1" w:color="auto" w:val="clear"/>
+        </w:rPr>
+        <w:t xml:space="preserve">tickerData.history(period='1d', start='2020-1-1', end='2020-12-31')</w:t>
+      </w:r>
+      <w:r>
+        <w:t xml:space="preserve"> downloads the historical market data for this ticker. The </w:t>
+      </w:r>
+      <w:r>
+        <w:rPr>
+          <w:color w:val="111111"/>
+          <w:shd w:fill="F1F1F1" w:color="auto" w:val="clear"/>
+        </w:rPr>
+        <w:t xml:space="preserve">period</w:t>
+      </w:r>
+      <w:r>
+        <w:t xml:space="preserve"> parameter defines the frequency at which to gather the historical data; common options would include </w:t>
+      </w:r>
+      <w:r>
+        <w:rPr>
+          <w:color w:val="111111"/>
+          <w:shd w:fill="F1F1F1" w:color="auto" w:val="clear"/>
+        </w:rPr>
+        <w:t xml:space="preserve">1d</w:t>
+      </w:r>
+      <w:r>
+        <w:t xml:space="preserve"> (daily), </w:t>
+      </w:r>
+      <w:r>
+        <w:rPr>
+          <w:color w:val="111111"/>
+          <w:shd w:fill="F1F1F1" w:color="auto" w:val="clear"/>
+        </w:rPr>
+        <w:t xml:space="preserve">1mo</w:t>
+      </w:r>
+      <w:r>
+        <w:t xml:space="preserve"> (monthly), </w:t>
+      </w:r>
+      <w:r>
+        <w:rPr>
+          <w:color w:val="111111"/>
+          <w:shd w:fill="F1F1F1" w:color="auto" w:val="clear"/>
+        </w:rPr>
+        <w:t xml:space="preserve">1y</w:t>
+      </w:r>
+      <w:r>
+        <w:t xml:space="preserve"> (yearly).</w:t>
+      </w:r>
+    </w:p>
+    <w:p>
+      <w:pPr>
+        <w:pStyle w:val="paragraph-text"/>
+      </w:pPr>
+      <w:r>
+        <w:t xml:space="preserve">The </w:t>
+      </w:r>
+      <w:r>
+        <w:rPr>
+          <w:color w:val="111111"/>
+          <w:shd w:fill="F1F1F1" w:color="auto" w:val="clear"/>
+        </w:rPr>
+        <w:t xml:space="preserve">start</w:t>
+      </w:r>
+      <w:r>
+        <w:t xml:space="preserve"> and </w:t>
+      </w:r>
+      <w:r>
+        <w:rPr>
+          <w:color w:val="111111"/>
+          <w:shd w:fill="F1F1F1" w:color="auto" w:val="clear"/>
+        </w:rPr>
+        <w:t xml:space="preserve">end</w:t>
+      </w:r>
+      <w:r>
+        <w:t xml:space="preserve"> parameters define the date range for the historical data.</w:t>
+      </w:r>
+    </w:p>
+    <w:p>
+      <w:pPr>
+        <w:pStyle w:val="paragraph-text"/>
+      </w:pPr>
+      <w:r>
+        <w:t xml:space="preserve">Finally, </w:t>
+      </w:r>
+      <w:r>
+        <w:rPr>
+          <w:color w:val="111111"/>
+          <w:shd w:fill="F1F1F1" w:color="auto" w:val="clear"/>
+        </w:rPr>
+        <w:t xml:space="preserve">print(tickerDf)</w:t>
+      </w:r>
+      <w:r>
+        <w:t xml:space="preserve"> prints the downloaded data to the console.</w:t>
+      </w:r>
+    </w:p>
+    <w:p>
+      <w:pPr>
+        <w:pStyle w:val="paragraph-text"/>
+      </w:pPr>
+      <w:r>
+        <w:t xml:space="preserve">Please replace </w:t>
+      </w:r>
+      <w:r>
+        <w:rPr>
+          <w:color w:val="111111"/>
+          <w:shd w:fill="F1F1F1" w:color="auto" w:val="clear"/>
+        </w:rPr>
+        <w:t xml:space="preserve">"AAPL"</w:t>
+      </w:r>
+      <w:r>
+        <w:t xml:space="preserve"> with your actual ticker symbol and adjust the date range as needed.</w:t>
+      </w:r>
+    </w:p>
+    <w:p>
+      <w:pPr>
+        <w:pStyle w:val="paragraph-text"/>
+      </w:pPr>
+      <w:r>
+        <w:t xml:space="preserve">I hope this helps! Let me know if you have any other questions. 😊</w:t>
+      </w:r>
+    </w:p>
+    <w:p>
+      <w:pPr>
+        <w:pStyle w:val="Heading1"/>
+      </w:pPr>
+      <w:r>
+        <w:rPr>
+          <w:color w:val="005366"/>
+        </w:rPr>
+        <w:t xml:space="preserve">You</w:t>
+      </w:r>
+    </w:p>
+    <w:p>
+      <w:pPr>
+        <w:pStyle w:val="paragraph-text"/>
+      </w:pPr>
+      <w:r>
+        <w:t xml:space="preserve">I found out the bug in the code below:</w:t>
+      </w:r>
+    </w:p>
+    <w:p>
+      <w:pPr>
+        <w:pStyle w:val="paragraph-text"/>
+      </w:pPr>
+      <w:r>
+        <w:t xml:space="preserve">import pandas as pd
+import xlwings as xw
+import yfinance as yf</w:t>
+      </w:r>
+    </w:p>
+    <w:p>
+      <w:pPr>
+        <w:pStyle w:val="paragraph-text"/>
+      </w:pPr>
+      <w:r>
+        <w:t xml:space="preserve">@xw.func
+def get_stock_data_yf(symbol, start_date, end_date):
+# Convert the date format from "dd/mm/yyyy" to "yyyy-mm-dd"
+start_date = datetime.datetime.strptime(start_date, "%d/%m/%Y").strftime("%Y-%m-%d")
+end_date = datetime.datetime.strptime(end_date, "%d/%m/%Y").strftime("%Y-%m-%d")</w:t>
+      </w:r>
+    </w:p>
+    <w:p>
+      <w:pPr>
+        <w:pStyle w:val="code"/>
+      </w:pPr>
+      <w:r>
+        <w:t xml:space="preserve"># Download historical market data</w:t>
+      </w:r>
+    </w:p>
+    <w:p>
+      <w:pPr>
+        <w:pStyle w:val="code"/>
+      </w:pPr>
+      <w:r>
+        <w:t xml:space="preserve">hist = yf.Ticker(symbol).history(start=start_date, end=end_date)</w:t>
+      </w:r>
+    </w:p>
+    <w:p>
+      <w:pPr>
+        <w:pStyle w:val="code"/>
+      </w:pPr>
+      <w:r>
+        <w:t xml:space="preserve"/>
+      </w:r>
+    </w:p>
+    <w:p>
+      <w:pPr>
+        <w:pStyle w:val="code"/>
+      </w:pPr>
+      <w:r>
+        <w:t xml:space="preserve"># Drop rows with missing values</w:t>
+      </w:r>
+    </w:p>
+    <w:p>
+      <w:pPr>
+        <w:pStyle w:val="code"/>
+      </w:pPr>
+      <w:r>
+        <w:t xml:space="preserve">hist.dropna(inplace=True)</w:t>
+      </w:r>
+    </w:p>
+    <w:p>
+      <w:pPr>
+        <w:pStyle w:val="code"/>
+      </w:pPr>
+      <w:r>
+        <w:t xml:space="preserve"/>
+      </w:r>
+    </w:p>
+    <w:p>
+      <w:pPr>
+        <w:pStyle w:val="code"/>
+      </w:pPr>
+      <w:r>
+        <w:t xml:space="preserve"># Prepare data for output</w:t>
+      </w:r>
+    </w:p>
+    <w:p>
+      <w:pPr>
+        <w:pStyle w:val="code"/>
+      </w:pPr>
+      <w:r>
+        <w:t xml:space="preserve">data = [hist.columns.values.tolist()] + hist.reset_index().values.tolist()</w:t>
+      </w:r>
+    </w:p>
+    <w:p>
+      <w:pPr>
+        <w:pStyle w:val="code"/>
+      </w:pPr>
+      <w:r>
+        <w:t xml:space="preserve"/>
+      </w:r>
+    </w:p>
+    <w:p>
+      <w:pPr>
+        <w:pStyle w:val="code"/>
+      </w:pPr>
+      <w:r>
+        <w:t xml:space="preserve">return data</w:t>
+      </w:r>
+    </w:p>
+    <w:p>
+      <w:pPr>
+        <w:pStyle w:val="paragraph-text"/>
+      </w:pPr>
+      <w:r>
+        <w:t xml:space="preserve">hist = yf.Ticker(symbol).history(start=start_date, end=end_date) - requires 3  input arguments as you can see in your testcode above.</w:t>
+      </w:r>
+    </w:p>
+    <w:p>
+      <w:pPr>
+        <w:pStyle w:val="Heading1"/>
+      </w:pPr>
+      <w:r>
+        <w:rPr>
+          <w:color w:val="123BB6"/>
+        </w:rPr>
+        <w:t xml:space="preserve">Copilot</w:t>
+      </w:r>
+    </w:p>
+    <w:p>
+      <w:pPr>
+        <w:pStyle w:val="paragraph-text"/>
+      </w:pPr>
+      <w:r>
+        <w:t xml:space="preserve">I apologize for the confusion. The </w:t>
+      </w:r>
+      <w:r>
+        <w:rPr>
+          <w:color w:val="111111"/>
+          <w:shd w:fill="F1F1F1" w:color="auto" w:val="clear"/>
+        </w:rPr>
+        <w:t xml:space="preserve">yf.Ticker(symbol).history()</w:t>
+      </w:r>
+      <w:r>
+        <w:t xml:space="preserve"> function requires a </w:t>
+      </w:r>
+      <w:r>
+        <w:rPr>
+          <w:color w:val="111111"/>
+          <w:shd w:fill="F1F1F1" w:color="auto" w:val="clear"/>
+        </w:rPr>
+        <w:t xml:space="preserve">period</w:t>
+      </w:r>
+      <w:r>
+        <w:t xml:space="preserve"> argument if the </w:t>
+      </w:r>
+      <w:r>
+        <w:rPr>
+          <w:color w:val="111111"/>
+          <w:shd w:fill="F1F1F1" w:color="auto" w:val="clear"/>
+        </w:rPr>
+        <w:t xml:space="preserve">start</w:t>
+      </w:r>
+      <w:r>
+        <w:t xml:space="preserve"> and </w:t>
+      </w:r>
+      <w:r>
+        <w:rPr>
+          <w:color w:val="111111"/>
+          <w:shd w:fill="F1F1F1" w:color="auto" w:val="clear"/>
+        </w:rPr>
+        <w:t xml:space="preserve">end</w:t>
+      </w:r>
+      <w:r>
+        <w:t xml:space="preserve"> arguments are not provided. However, if you provide both </w:t>
+      </w:r>
+      <w:r>
+        <w:rPr>
+          <w:color w:val="111111"/>
+          <w:shd w:fill="F1F1F1" w:color="auto" w:val="clear"/>
+        </w:rPr>
+        <w:t xml:space="preserve">start</w:t>
+      </w:r>
+      <w:r>
+        <w:t xml:space="preserve"> and </w:t>
+      </w:r>
+      <w:r>
+        <w:rPr>
+          <w:color w:val="111111"/>
+          <w:shd w:fill="F1F1F1" w:color="auto" w:val="clear"/>
+        </w:rPr>
+        <w:t xml:space="preserve">end</w:t>
+      </w:r>
+      <w:r>
+        <w:t xml:space="preserve"> arguments, the </w:t>
+      </w:r>
+      <w:r>
+        <w:rPr>
+          <w:color w:val="111111"/>
+          <w:shd w:fill="F1F1F1" w:color="auto" w:val="clear"/>
+        </w:rPr>
+        <w:t xml:space="preserve">period</w:t>
+      </w:r>
+      <w:r>
+        <w:t xml:space="preserve"> argument is not necessary.</w:t>
+      </w:r>
+    </w:p>
+    <w:p>
+      <w:pPr>
+        <w:pStyle w:val="paragraph-text"/>
+      </w:pPr>
+      <w:r>
+        <w:t xml:space="preserve">In your function </w:t>
+      </w:r>
+      <w:r>
+        <w:rPr>
+          <w:color w:val="111111"/>
+          <w:shd w:fill="F1F1F1" w:color="auto" w:val="clear"/>
+        </w:rPr>
+        <w:t xml:space="preserve">get_stock_data_yf</w:t>
+      </w:r>
+      <w:r>
+        <w:t xml:space="preserve">, you're correctly providing both </w:t>
+      </w:r>
+      <w:r>
+        <w:rPr>
+          <w:color w:val="111111"/>
+          <w:shd w:fill="F1F1F1" w:color="auto" w:val="clear"/>
+        </w:rPr>
+        <w:t xml:space="preserve">start</w:t>
+      </w:r>
+      <w:r>
+        <w:t xml:space="preserve"> and </w:t>
+      </w:r>
+      <w:r>
+        <w:rPr>
+          <w:color w:val="111111"/>
+          <w:shd w:fill="F1F1F1" w:color="auto" w:val="clear"/>
+        </w:rPr>
+        <w:t xml:space="preserve">end</w:t>
+      </w:r>
+      <w:r>
+        <w:t xml:space="preserve"> arguments to the </w:t>
+      </w:r>
+      <w:r>
+        <w:rPr>
+          <w:color w:val="111111"/>
+          <w:shd w:fill="F1F1F1" w:color="auto" w:val="clear"/>
+        </w:rPr>
+        <w:t xml:space="preserve">history()</w:t>
+      </w:r>
+      <w:r>
+        <w:t xml:space="preserve"> function, so you don't need to provide a </w:t>
+      </w:r>
+      <w:r>
+        <w:rPr>
+          <w:color w:val="111111"/>
+          <w:shd w:fill="F1F1F1" w:color="auto" w:val="clear"/>
+        </w:rPr>
+        <w:t xml:space="preserve">period</w:t>
+      </w:r>
+      <w:r>
+        <w:t xml:space="preserve"> argument.</w:t>
+      </w:r>
+    </w:p>
+    <w:p>
+      <w:pPr>
+        <w:pStyle w:val="paragraph-text"/>
+      </w:pPr>
+      <w:r>
+        <w:t xml:space="preserve">Here's the correct usage of the </w:t>
+      </w:r>
+      <w:r>
+        <w:rPr>
+          <w:color w:val="111111"/>
+          <w:shd w:fill="F1F1F1" w:color="auto" w:val="clear"/>
+        </w:rPr>
+        <w:t xml:space="preserve">history()</w:t>
+      </w:r>
+      <w:r>
+        <w:t xml:space="preserve"> function in your case:</w:t>
+      </w:r>
+    </w:p>
+    <w:p>
+      <w:pPr>
+        <w:pStyle w:val="code"/>
+      </w:pPr>
+      <w:r>
+        <w:t xml:space="preserve">import datetime</w:t>
+      </w:r>
+    </w:p>
+    <w:p>
+      <w:pPr>
+        <w:pStyle w:val="code"/>
+      </w:pPr>
+      <w:r>
+        <w:t xml:space="preserve">import xlwings as xw</w:t>
+      </w:r>
+    </w:p>
+    <w:p>
+      <w:pPr>
+        <w:pStyle w:val="code"/>
+      </w:pPr>
+      <w:r>
+        <w:t xml:space="preserve">import yfinance as yf</w:t>
+      </w:r>
+    </w:p>
+    <w:p>
+      <w:pPr>
+        <w:pStyle w:val="code"/>
+      </w:pPr>
+      <w:r>
+        <w:t xml:space="preserve"/>
+      </w:r>
+    </w:p>
+    <w:p>
+      <w:pPr>
+        <w:pStyle w:val="code"/>
+      </w:pPr>
+      <w:r>
+        <w:t xml:space="preserve">@xw.func</w:t>
+      </w:r>
+    </w:p>
+    <w:p>
+      <w:pPr>
+        <w:pStyle w:val="code"/>
+      </w:pPr>
+      <w:r>
+        <w:t xml:space="preserve">def get_stock_data_yf(symbol, start_date, end_date):</w:t>
+      </w:r>
+    </w:p>
+    <w:p>
+      <w:pPr>
+        <w:pStyle w:val="code"/>
+      </w:pPr>
+      <w:r>
+        <w:t xml:space="preserve">    # Convert the date format from "dd/mm/yyyy" to "yyyy-mm-dd"</w:t>
+      </w:r>
+    </w:p>
+    <w:p>
+      <w:pPr>
+        <w:pStyle w:val="code"/>
+      </w:pPr>
+      <w:r>
+        <w:t xml:space="preserve">    start_date = datetime.datetime.strptime(start_date, "%d/%m/%Y").strftime("%Y-%m-%d")</w:t>
+      </w:r>
+    </w:p>
+    <w:p>
+      <w:pPr>
+        <w:pStyle w:val="code"/>
+      </w:pPr>
+      <w:r>
+        <w:t xml:space="preserve">    end_date = datetime.datetime.strptime(end_date, "%d/%m/%Y").strftime("%Y-%m-%d")</w:t>
+      </w:r>
+    </w:p>
+    <w:p>
+      <w:pPr>
+        <w:pStyle w:val="code"/>
+      </w:pPr>
+      <w:r>
+        <w:t xml:space="preserve"/>
+      </w:r>
+    </w:p>
+    <w:p>
+      <w:pPr>
+        <w:pStyle w:val="code"/>
+      </w:pPr>
+      <w:r>
+        <w:t xml:space="preserve">    # Download historical market data</w:t>
+      </w:r>
+    </w:p>
+    <w:p>
+      <w:pPr>
+        <w:pStyle w:val="code"/>
+      </w:pPr>
+      <w:r>
+        <w:t xml:space="preserve">    hist = yf.Ticker(symbol).history(start=start_date, end=end_date)</w:t>
+      </w:r>
+    </w:p>
+    <w:p>
+      <w:pPr>
+        <w:pStyle w:val="code"/>
+      </w:pPr>
+      <w:r>
+        <w:t xml:space="preserve"/>
+      </w:r>
+    </w:p>
+    <w:p>
+      <w:pPr>
+        <w:pStyle w:val="code"/>
+      </w:pPr>
+      <w:r>
+        <w:t xml:space="preserve">    # Drop rows with missing values</w:t>
+      </w:r>
+    </w:p>
+    <w:p>
+      <w:pPr>
+        <w:pStyle w:val="code"/>
+      </w:pPr>
+      <w:r>
+        <w:t xml:space="preserve">    hist.dropna(inplace=True)</w:t>
+      </w:r>
+    </w:p>
+    <w:p>
+      <w:pPr>
+        <w:pStyle w:val="code"/>
+      </w:pPr>
+      <w:r>
+        <w:t xml:space="preserve"/>
+      </w:r>
+    </w:p>
+    <w:p>
+      <w:pPr>
+        <w:pStyle w:val="code"/>
+      </w:pPr>
+      <w:r>
+        <w:t xml:space="preserve">    # Prepare data for output</w:t>
+      </w:r>
+    </w:p>
+    <w:p>
+      <w:pPr>
+        <w:pStyle w:val="code"/>
+      </w:pPr>
+      <w:r>
+        <w:t xml:space="preserve">    data = [hist.columns.values.tolist()] + hist.reset_index().values.tolist()</w:t>
+      </w:r>
+    </w:p>
+    <w:p>
+      <w:pPr>
+        <w:pStyle w:val="code"/>
+      </w:pPr>
+      <w:r>
+        <w:t xml:space="preserve"/>
+      </w:r>
+    </w:p>
+    <w:p>
+      <w:pPr>
+        <w:pStyle w:val="code"/>
+      </w:pPr>
+      <w:r>
+        <w:t xml:space="preserve">    return data</w:t>
+      </w:r>
+    </w:p>
+    <w:p>
+      <w:pPr>
+        <w:pStyle w:val="paragraph-text"/>
+      </w:pPr>
+      <w:r>
+        <w:t xml:space="preserve">In this function, </w:t>
+      </w:r>
+      <w:r>
+        <w:rPr>
+          <w:color w:val="111111"/>
+          <w:shd w:fill="F1F1F1" w:color="auto" w:val="clear"/>
+        </w:rPr>
+        <w:t xml:space="preserve">yf.Ticker(symbol).history(start=start_date, end=end_date)</w:t>
+      </w:r>
+      <w:r>
+        <w:t xml:space="preserve"> downloads the historical market data for the specified symbol between the </w:t>
+      </w:r>
+      <w:r>
+        <w:rPr>
+          <w:color w:val="111111"/>
+          <w:shd w:fill="F1F1F1" w:color="auto" w:val="clear"/>
+        </w:rPr>
+        <w:t xml:space="preserve">start_date</w:t>
+      </w:r>
+      <w:r>
+        <w:t xml:space="preserve"> and </w:t>
+      </w:r>
+      <w:r>
+        <w:rPr>
+          <w:color w:val="111111"/>
+          <w:shd w:fill="F1F1F1" w:color="auto" w:val="clear"/>
+        </w:rPr>
+        <w:t xml:space="preserve">end_date</w:t>
+      </w:r>
+      <w:r>
+        <w:t xml:space="preserve">.</w:t>
+      </w:r>
+    </w:p>
+    <w:p>
+      <w:pPr>
+        <w:pStyle w:val="paragraph-text"/>
+      </w:pPr>
+      <w:r>
+        <w:t xml:space="preserve">I hope this helps! Let me know if you have any other questions. 😊</w:t>
+      </w:r>
+    </w:p>
+    <w:p>
+      <w:pPr>
+        <w:pStyle w:val="paragraph-text"/>
+        <w:pBdr>
+          <w:top w:val="single" w:color="d9d9d9" w:sz="8" w:space="10"/>
+        </w:pBdr>
+      </w:pPr>
+      <w:r>
+        <w:t xml:space="preserve">Source(s)</w:t>
+      </w:r>
+    </w:p>
+    <w:p>
+      <w:pPr>
+        <w:pStyle w:val="citation"/>
+      </w:pPr>
+      <w:r>
+        <w:t xml:space="preserve">1. </w:t>
+      </w:r>
+      <w:hyperlink w:history="1" r:id="rIdp4efb0z73k92sqsuyxyki">
+        <w:r>
+          <w:rPr>
+            <w:rStyle w:val="Hyperlink"/>
+          </w:rPr>
+          <w:t xml:space="preserve">github.com</w:t>
+        </w:r>
+      </w:hyperlink>
+    </w:p>
+    <w:p>
+      <w:pPr>
+        <w:pStyle w:val="paragraph-text"/>
+      </w:pPr>
+    </w:p>
+    <w:p>
+      <w:pPr>
+        <w:pStyle w:val="Heading1"/>
+      </w:pPr>
+      <w:r>
+        <w:rPr>
+          <w:color w:val="005366"/>
+        </w:rPr>
+        <w:t xml:space="preserve">You</w:t>
+      </w:r>
+    </w:p>
+    <w:p>
+      <w:pPr>
+        <w:pStyle w:val="paragraph-text"/>
+      </w:pPr>
+      <w:r>
+        <w:t xml:space="preserve">But you said above in example code:</w:t>
+      </w:r>
+    </w:p>
+    <w:p>
+      <w:pPr>
+        <w:pStyle w:val="paragraph-text"/>
+      </w:pPr>
+      <w:r>
+        <w:t xml:space="preserve">In this script, yf.Ticker(symbol) creates a Ticker object for the specified symbol. tickerData.history(period='1d', start='2020-1-1', end='2020-12-31') downloads the historical market data for this ticker. The period parameter defines the frequency at which to gather the historical data; common options would include 1d (daily), 1mo (monthly), 1y (yearly).</w:t>
+      </w:r>
+    </w:p>
+    <w:p>
+      <w:pPr>
+        <w:pStyle w:val="paragraph-text"/>
+      </w:pPr>
+      <w:r>
+        <w:t xml:space="preserve">The start and end parameters define the date range for the historical data.</w:t>
+      </w:r>
+    </w:p>
+    <w:p>
+      <w:pPr>
+        <w:pStyle w:val="Heading1"/>
+      </w:pPr>
+      <w:r>
+        <w:rPr>
+          <w:color w:val="123BB6"/>
+        </w:rPr>
+        <w:t xml:space="preserve">Copilot</w:t>
+      </w:r>
+    </w:p>
+    <w:p>
+      <w:pPr>
+        <w:pStyle w:val="paragraph-text"/>
+      </w:pPr>
+      <w:r>
+        <w:t xml:space="preserve">I apologize for any confusion. The </w:t>
+      </w:r>
+      <w:r>
+        <w:rPr>
+          <w:color w:val="111111"/>
+          <w:shd w:fill="F1F1F1" w:color="auto" w:val="clear"/>
+        </w:rPr>
+        <w:t xml:space="preserve">period</w:t>
+      </w:r>
+      <w:r>
+        <w:t xml:space="preserve"> parameter in the </w:t>
+      </w:r>
+      <w:r>
+        <w:rPr>
+          <w:color w:val="111111"/>
+          <w:shd w:fill="F1F1F1" w:color="auto" w:val="clear"/>
+        </w:rPr>
+        <w:t xml:space="preserve">history()</w:t>
+      </w:r>
+      <w:r>
+        <w:t xml:space="preserve"> function is optional and is used to define the frequency of historical market data. If you provide a </w:t>
+      </w:r>
+      <w:r>
+        <w:rPr>
+          <w:color w:val="111111"/>
+          <w:shd w:fill="F1F1F1" w:color="auto" w:val="clear"/>
+        </w:rPr>
+        <w:t xml:space="preserve">start</w:t>
+      </w:r>
+      <w:r>
+        <w:t xml:space="preserve"> and </w:t>
+      </w:r>
+      <w:r>
+        <w:rPr>
+          <w:color w:val="111111"/>
+          <w:shd w:fill="F1F1F1" w:color="auto" w:val="clear"/>
+        </w:rPr>
+        <w:t xml:space="preserve">end</w:t>
+      </w:r>
+      <w:r>
+        <w:t xml:space="preserve"> date, the </w:t>
+      </w:r>
+      <w:r>
+        <w:rPr>
+          <w:color w:val="111111"/>
+          <w:shd w:fill="F1F1F1" w:color="auto" w:val="clear"/>
+        </w:rPr>
+        <w:t xml:space="preserve">history()</w:t>
+      </w:r>
+      <w:r>
+        <w:t xml:space="preserve"> function will return daily data for that date range, so you don't need to specify </w:t>
+      </w:r>
+      <w:r>
+        <w:rPr>
+          <w:color w:val="111111"/>
+          <w:shd w:fill="F1F1F1" w:color="auto" w:val="clear"/>
+        </w:rPr>
+        <w:t xml:space="preserve">period='1d'</w:t>
+      </w:r>
+      <w:r>
+        <w:t xml:space="preserve">.</w:t>
+      </w:r>
+    </w:p>
+    <w:p>
+      <w:pPr>
+        <w:pStyle w:val="paragraph-text"/>
+      </w:pPr>
+      <w:r>
+        <w:t xml:space="preserve">However, if you want to specify the </w:t>
+      </w:r>
+      <w:r>
+        <w:rPr>
+          <w:color w:val="111111"/>
+          <w:shd w:fill="F1F1F1" w:color="auto" w:val="clear"/>
+        </w:rPr>
+        <w:t xml:space="preserve">period</w:t>
+      </w:r>
+      <w:r>
+        <w:t xml:space="preserve"> parameter for clarity, you can certainly do so. Here's how you can modify your function:</w:t>
+      </w:r>
+    </w:p>
+    <w:p>
+      <w:pPr>
+        <w:pStyle w:val="code"/>
+      </w:pPr>
+      <w:r>
+        <w:t xml:space="preserve">import datetime</w:t>
+      </w:r>
+    </w:p>
+    <w:p>
+      <w:pPr>
+        <w:pStyle w:val="code"/>
+      </w:pPr>
+      <w:r>
+        <w:t xml:space="preserve">import xlwings as xw</w:t>
+      </w:r>
+    </w:p>
+    <w:p>
+      <w:pPr>
+        <w:pStyle w:val="code"/>
+      </w:pPr>
+      <w:r>
+        <w:t xml:space="preserve">import yfinance as yf</w:t>
+      </w:r>
+    </w:p>
+    <w:p>
+      <w:pPr>
+        <w:pStyle w:val="code"/>
+      </w:pPr>
+      <w:r>
+        <w:t xml:space="preserve"/>
+      </w:r>
+    </w:p>
+    <w:p>
+      <w:pPr>
+        <w:pStyle w:val="code"/>
+      </w:pPr>
+      <w:r>
+        <w:t xml:space="preserve">@xw.func</w:t>
+      </w:r>
+    </w:p>
+    <w:p>
+      <w:pPr>
+        <w:pStyle w:val="code"/>
+      </w:pPr>
+      <w:r>
+        <w:t xml:space="preserve">def get_stock_data_yf(symbol, start_date, end_date):</w:t>
+      </w:r>
+    </w:p>
+    <w:p>
+      <w:pPr>
+        <w:pStyle w:val="code"/>
+      </w:pPr>
+      <w:r>
+        <w:t xml:space="preserve">    # Convert the date format from "dd/mm/yyyy" to "yyyy-mm-dd"</w:t>
+      </w:r>
+    </w:p>
+    <w:p>
+      <w:pPr>
+        <w:pStyle w:val="code"/>
+      </w:pPr>
+      <w:r>
+        <w:t xml:space="preserve">    start_date = datetime.datetime.strptime(start_date, "%d/%m/%Y").strftime("%Y-%m-%d")</w:t>
+      </w:r>
+    </w:p>
+    <w:p>
+      <w:pPr>
+        <w:pStyle w:val="code"/>
+      </w:pPr>
+      <w:r>
+        <w:t xml:space="preserve">    end_date = datetime.datetime.strptime(end_date, "%d/%m/%Y").strftime("%Y-%m-%d")</w:t>
+      </w:r>
+    </w:p>
+    <w:p>
+      <w:pPr>
+        <w:pStyle w:val="code"/>
+      </w:pPr>
+      <w:r>
+        <w:t xml:space="preserve"/>
+      </w:r>
+    </w:p>
+    <w:p>
+      <w:pPr>
+        <w:pStyle w:val="code"/>
+      </w:pPr>
+      <w:r>
+        <w:t xml:space="preserve">    # Download historical market data</w:t>
+      </w:r>
+    </w:p>
+    <w:p>
+      <w:pPr>
+        <w:pStyle w:val="code"/>
+      </w:pPr>
+      <w:r>
+        <w:t xml:space="preserve">    hist = yf.Ticker(symbol).history(period='1d', start=start_date, end=end_date)</w:t>
+      </w:r>
+    </w:p>
+    <w:p>
+      <w:pPr>
+        <w:pStyle w:val="code"/>
+      </w:pPr>
+      <w:r>
+        <w:t xml:space="preserve"/>
+      </w:r>
+    </w:p>
+    <w:p>
+      <w:pPr>
+        <w:pStyle w:val="code"/>
+      </w:pPr>
+      <w:r>
+        <w:t xml:space="preserve">    # Drop rows with missing values</w:t>
+      </w:r>
+    </w:p>
+    <w:p>
+      <w:pPr>
+        <w:pStyle w:val="code"/>
+      </w:pPr>
+      <w:r>
+        <w:t xml:space="preserve">    hist.dropna(inplace=True)</w:t>
+      </w:r>
+    </w:p>
+    <w:p>
+      <w:pPr>
+        <w:pStyle w:val="code"/>
+      </w:pPr>
+      <w:r>
+        <w:t xml:space="preserve"/>
+      </w:r>
+    </w:p>
+    <w:p>
+      <w:pPr>
+        <w:pStyle w:val="code"/>
+      </w:pPr>
+      <w:r>
+        <w:t xml:space="preserve">    # Prepare data for output</w:t>
+      </w:r>
+    </w:p>
+    <w:p>
+      <w:pPr>
+        <w:pStyle w:val="code"/>
+      </w:pPr>
+      <w:r>
+        <w:t xml:space="preserve">    data = [hist.columns.values.tolist()] + hist.reset_index().values.tolist()</w:t>
+      </w:r>
+    </w:p>
+    <w:p>
+      <w:pPr>
+        <w:pStyle w:val="code"/>
+      </w:pPr>
+      <w:r>
+        <w:t xml:space="preserve"/>
+      </w:r>
+    </w:p>
+    <w:p>
+      <w:pPr>
+        <w:pStyle w:val="code"/>
+      </w:pPr>
+      <w:r>
+        <w:t xml:space="preserve">    return data</w:t>
+      </w:r>
+    </w:p>
+    <w:p>
+      <w:pPr>
+        <w:pStyle w:val="paragraph-text"/>
+      </w:pPr>
+      <w:r>
+        <w:t xml:space="preserve">In this modified function, </w:t>
+      </w:r>
+      <w:r>
+        <w:rPr>
+          <w:color w:val="111111"/>
+          <w:shd w:fill="F1F1F1" w:color="auto" w:val="clear"/>
+        </w:rPr>
+        <w:t xml:space="preserve">yf.Ticker(symbol).history(period='1d', start=start_date, end=end_date)</w:t>
+      </w:r>
+      <w:r>
+        <w:t xml:space="preserve"> downloads the daily historical market data for the specified symbol between the </w:t>
+      </w:r>
+      <w:r>
+        <w:rPr>
+          <w:color w:val="111111"/>
+          <w:shd w:fill="F1F1F1" w:color="auto" w:val="clear"/>
+        </w:rPr>
+        <w:t xml:space="preserve">start_date</w:t>
+      </w:r>
+      <w:r>
+        <w:t xml:space="preserve"> and </w:t>
+      </w:r>
+      <w:r>
+        <w:rPr>
+          <w:color w:val="111111"/>
+          <w:shd w:fill="F1F1F1" w:color="auto" w:val="clear"/>
+        </w:rPr>
+        <w:t xml:space="preserve">end_date</w:t>
+      </w:r>
+      <w:r>
+        <w:t xml:space="preserve">.</w:t>
+      </w:r>
+    </w:p>
+    <w:p>
+      <w:pPr>
+        <w:pStyle w:val="paragraph-text"/>
+      </w:pPr>
+      <w:r>
+        <w:t xml:space="preserve">I hope this clears up any confusion. Let me know if you have any other questions! 😊</w:t>
+      </w:r>
+    </w:p>
+    <w:p>
+      <w:pPr>
+        <w:pStyle w:val="paragraph-text"/>
+        <w:pBdr>
+          <w:top w:val="single" w:color="d9d9d9" w:sz="8" w:space="10"/>
+        </w:pBdr>
+      </w:pPr>
+      <w:r>
+        <w:t xml:space="preserve">Source(s)</w:t>
+      </w:r>
+    </w:p>
+    <w:p>
+      <w:pPr>
+        <w:pStyle w:val="citation"/>
+      </w:pPr>
+      <w:r>
+        <w:t xml:space="preserve">1. </w:t>
+      </w:r>
+      <w:hyperlink w:history="1" r:id="rIdd3j-sezlk3dbbai6bcp6y">
+        <w:r>
+          <w:rPr>
+            <w:rStyle w:val="Hyperlink"/>
+          </w:rPr>
+          <w:t xml:space="preserve">github.com</w:t>
+        </w:r>
+      </w:hyperlink>
+    </w:p>
+    <w:p>
+      <w:pPr>
+        <w:pStyle w:val="paragraph-text"/>
+      </w:pPr>
+    </w:p>
     <w:sectPr>
       <w:headerReference w:type="default" r:id="rId6"/>
       <w:pgSz w:w="11906" w:h="16838" w:orient="portrait"/>
@@ -6123,7 +9101,7 @@
 
 <file path=word/numbering.xml><?xml version="1.0" encoding="utf-8"?>
 <w:numbering xmlns:wpc="http://schemas.microsoft.com/office/word/2010/wordprocessingCanvas" xmlns:mc="http://schemas.openxmlformats.org/markup-compatibility/2006" xmlns:o="urn:schemas-microsoft-com:office:office" xmlns:r="http://schemas.openxmlformats.org/officeDocument/2006/relationships" xmlns:m="http://schemas.openxmlformats.org/officeDocument/2006/math" xmlns:v="urn:schemas-microsoft-com:vml" xmlns:wp14="http://schemas.microsoft.com/office/word/2010/wordprocessingDrawing" xmlns:wp="http://schemas.openxmlformats.org/drawingml/2006/wordprocessingDrawing" xmlns:w10="urn:schemas-microsoft-com:office:word" xmlns:w="http://schemas.openxmlformats.org/wordprocessingml/2006/main" xmlns:w14="http://schemas.microsoft.com/office/word/2010/wordml" xmlns:w15="http://schemas.microsoft.com/office/word/2012/wordml" xmlns:wpg="http://schemas.microsoft.com/office/word/2010/wordprocessingGroup" xmlns:wpi="http://schemas.microsoft.com/office/word/2010/wordprocessingInk" xmlns:wne="http://schemas.microsoft.com/office/word/2006/wordml" xmlns:wps="http://schemas.microsoft.com/office/word/2010/wordprocessingShape" mc:Ignorable="w14 w15 wp14">
-  <w:abstractNum w:abstractNumId="1" w15:restartNumberingAfterBreak="0">
+  <w:abstractNum w:abstractNumId="3" w15:restartNumberingAfterBreak="0">
     <w:multiLevelType w:val="hybridMultilevel"/>
     <w:lvl w:ilvl="0" w15:tentative="1">
       <w:start w:val="1"/>
@@ -6207,7 +9185,7 @@
       </w:pPr>
     </w:lvl>
   </w:abstractNum>
-  <w:abstractNum w:abstractNumId="2" w15:restartNumberingAfterBreak="0">
+  <w:abstractNum w:abstractNumId="4" w15:restartNumberingAfterBreak="0">
     <w:multiLevelType w:val="hybridMultilevel"/>
     <w:lvl w:ilvl="0" w15:tentative="1">
       <w:start w:val="1"/>
@@ -6247,13 +9225,13 @@
     </w:lvl>
   </w:abstractNum>
   <w:num w:numId="1">
-    <w:abstractNumId w:val="1"/>
+    <w:abstractNumId w:val="3"/>
     <w:lvlOverride w:ilvl="0">
       <w:startOverride w:val="1"/>
     </w:lvlOverride>
   </w:num>
-  <w:num w:numId="3">
-    <w:abstractNumId w:val="2"/>
+  <w:num w:numId="5">
+    <w:abstractNumId w:val="4"/>
   </w:num>
 </w:numbering>
 </file>

</xml_diff>